<commit_message>
Actualizacion de variables en plantilla word
</commit_message>
<xml_diff>
--- a/plantilla.docx
+++ b/plantilla.docx
@@ -521,8 +521,34 @@
                 <w:szCs w:val="18"/>
               </w:rPr>
             </w:pPr>
-            <w:r>
-              <w:t>{{fecha}}</w:t>
+            <w:proofErr w:type="gramStart"/>
+            <w:r>
+              <w:t>{{</w:t>
+            </w:r>
+            <w:r>
+              <w:t xml:space="preserve"> </w:t>
+            </w:r>
+            <w:r>
+              <w:rPr>
+                <w:b/>
+                <w:bCs/>
+                <w:sz w:val="18"/>
+                <w:szCs w:val="18"/>
+              </w:rPr>
+              <w:t>fecha</w:t>
+            </w:r>
+            <w:proofErr w:type="gramEnd"/>
+            <w:r>
+              <w:rPr>
+                <w:b/>
+                <w:bCs/>
+                <w:sz w:val="18"/>
+                <w:szCs w:val="18"/>
+              </w:rPr>
+              <w:t xml:space="preserve"> </w:t>
+            </w:r>
+            <w:r>
+              <w:t>}}</w:t>
             </w:r>
           </w:p>
         </w:tc>
@@ -696,8 +722,26 @@
         </w:rPr>
         <w:t xml:space="preserve">de Servicios y Canales de la Agencia </w:t>
       </w:r>
-      <w:r>
-        <w:t>{{provincia}}</w:t>
+      <w:proofErr w:type="gramStart"/>
+      <w:r>
+        <w:t>{{</w:t>
+      </w:r>
+      <w:r>
+        <w:t xml:space="preserve"> </w:t>
+      </w:r>
+      <w:r>
+        <w:rPr>
+          <w:sz w:val="18"/>
+          <w:szCs w:val="18"/>
+        </w:rPr>
+        <w:t>provincia</w:t>
+      </w:r>
+      <w:proofErr w:type="gramEnd"/>
+      <w:r>
+        <w:t xml:space="preserve"> </w:t>
+      </w:r>
+      <w:r>
+        <w:t>}}</w:t>
       </w:r>
       <w:r>
         <w:rPr>
@@ -723,23 +767,13 @@
         </w:rPr>
         <w:t xml:space="preserve">como </w:t>
       </w:r>
-      <w:proofErr w:type="gramStart"/>
-      <w:r>
-        <w:rPr>
-          <w:sz w:val="18"/>
-          <w:szCs w:val="18"/>
-          <w:lang w:val="es-ES"/>
-        </w:rPr>
-        <w:t>Jefe</w:t>
-      </w:r>
-      <w:proofErr w:type="gramEnd"/>
-      <w:r>
-        <w:rPr>
-          <w:sz w:val="18"/>
-          <w:szCs w:val="18"/>
-          <w:lang w:val="es-ES"/>
-        </w:rPr>
-        <w:t xml:space="preserve"> Técnico</w:t>
+      <w:r>
+        <w:rPr>
+          <w:sz w:val="18"/>
+          <w:szCs w:val="18"/>
+          <w:lang w:val="es-ES"/>
+        </w:rPr>
+        <w:t>Jefe Técnico</w:t>
       </w:r>
       <w:r>
         <w:rPr>
@@ -767,8 +801,26 @@
         </w:rPr>
         <w:t xml:space="preserve">El servicio fue realizado por el técnico </w:t>
       </w:r>
-      <w:r>
-        <w:t>{{nombre}}</w:t>
+      <w:proofErr w:type="gramStart"/>
+      <w:r>
+        <w:t>{{</w:t>
+      </w:r>
+      <w:r>
+        <w:t xml:space="preserve"> </w:t>
+      </w:r>
+      <w:r>
+        <w:rPr>
+          <w:sz w:val="18"/>
+          <w:szCs w:val="18"/>
+        </w:rPr>
+        <w:t>nombre</w:t>
+      </w:r>
+      <w:proofErr w:type="gramEnd"/>
+      <w:r>
+        <w:t xml:space="preserve"> </w:t>
+      </w:r>
+      <w:r>
+        <w:t>}}</w:t>
       </w:r>
       <w:r>
         <w:rPr>
@@ -1098,11 +1150,10 @@
         <w:sdt>
           <w:sdtPr>
             <w:rPr>
-              <w:rFonts w:ascii="Arial" w:hAnsi="Arial" w:cs="Arial"/>
               <w:b/>
               <w:bCs/>
-              <w:sz w:val="18"/>
-              <w:szCs w:val="18"/>
+              <w:kern w:val="0"/>
+              <w14:ligatures w14:val="none"/>
             </w:rPr>
             <w:id w:val="1700655975"/>
             <w:placeholder>
@@ -1125,15 +1176,25 @@
                     <w:lang w:val="es-ES"/>
                   </w:rPr>
                 </w:pPr>
+                <w:proofErr w:type="gramStart"/>
                 <w:r>
                   <w:rPr>
-                    <w:rFonts w:ascii="Arial" w:hAnsi="Arial" w:cs="Arial"/>
                     <w:b/>
                     <w:bCs/>
-                    <w:sz w:val="18"/>
-                    <w:szCs w:val="18"/>
+                    <w:kern w:val="0"/>
+                    <w14:ligatures w14:val="none"/>
                   </w:rPr>
-                  <w:t>PEDRO CARBO</w:t>
+                  <w:t>{{ provincia</w:t>
+                </w:r>
+                <w:proofErr w:type="gramEnd"/>
+                <w:r>
+                  <w:rPr>
+                    <w:b/>
+                    <w:bCs/>
+                    <w:kern w:val="0"/>
+                    <w14:ligatures w14:val="none"/>
+                  </w:rPr>
+                  <w:t xml:space="preserve"> }}</w:t>
                 </w:r>
               </w:p>
             </w:tc>
@@ -1521,8 +1582,22 @@
         </w:rPr>
         <w:t xml:space="preserve"> </w:t>
       </w:r>
-      <w:r>
-        <w:t>{{problema}}</w:t>
+      <w:proofErr w:type="gramStart"/>
+      <w:r>
+        <w:t>{{</w:t>
+      </w:r>
+      <w:r>
+        <w:t xml:space="preserve"> </w:t>
+      </w:r>
+      <w:r>
+        <w:t>problema</w:t>
+      </w:r>
+      <w:proofErr w:type="gramEnd"/>
+      <w:r>
+        <w:t xml:space="preserve"> </w:t>
+      </w:r>
+      <w:r>
+        <w:t>}}</w:t>
       </w:r>
     </w:p>
     <w:p>
@@ -3089,6 +3164,7 @@
     <w:rsidRoot w:val="003E2CAD"/>
     <w:rsid w:val="000508A0"/>
     <w:rsid w:val="00062FA6"/>
+    <w:rsid w:val="0008077E"/>
     <w:rsid w:val="000A0172"/>
     <w:rsid w:val="000B0E57"/>
     <w:rsid w:val="000F1811"/>
@@ -3103,6 +3179,7 @@
     <w:rsid w:val="004B1A59"/>
     <w:rsid w:val="0066354D"/>
     <w:rsid w:val="007773F1"/>
+    <w:rsid w:val="007844D0"/>
     <w:rsid w:val="007D5E00"/>
     <w:rsid w:val="008036A6"/>
     <w:rsid w:val="00825D09"/>

</xml_diff>

<commit_message>
se agrega delegado como dato
</commit_message>
<xml_diff>
--- a/plantilla.docx
+++ b/plantilla.docx
@@ -671,7 +671,23 @@
           <w:szCs w:val="18"/>
           <w:lang w:val="es-ES"/>
         </w:rPr>
-        <w:t xml:space="preserve">, comparecen a la suscripción de la presente acta entrega recepción; por una parte, BANECUADOR representada por </w:t>
+        <w:t>, comparecen a la suscripción de la presente acta entrega recepción; por una parte, BANECUADOR representada por</w:t>
+      </w:r>
+      <w:r>
+        <w:rPr>
+          <w:sz w:val="18"/>
+          <w:szCs w:val="18"/>
+          <w:lang w:val="es-ES"/>
+        </w:rPr>
+        <w:t xml:space="preserve"> el/la</w:t>
+      </w:r>
+      <w:r>
+        <w:rPr>
+          <w:sz w:val="18"/>
+          <w:szCs w:val="18"/>
+          <w:lang w:val="es-ES"/>
+        </w:rPr>
+        <w:t xml:space="preserve"> </w:t>
       </w:r>
       <w:r>
         <w:rPr>
@@ -680,7 +696,25 @@
           <w:szCs w:val="18"/>
           <w:lang w:val="es-ES"/>
         </w:rPr>
-        <w:t>Srta.</w:t>
+        <w:t>Sr</w:t>
+      </w:r>
+      <w:r>
+        <w:rPr>
+          <w:rFonts w:ascii="Calibri" w:eastAsia="Calibri" w:hAnsi="Calibri" w:cs="Calibri"/>
+          <w:sz w:val="18"/>
+          <w:szCs w:val="18"/>
+          <w:lang w:val="es-ES"/>
+        </w:rPr>
+        <w:t>/Sr</w:t>
+      </w:r>
+      <w:r>
+        <w:rPr>
+          <w:rFonts w:ascii="Calibri" w:eastAsia="Calibri" w:hAnsi="Calibri" w:cs="Calibri"/>
+          <w:sz w:val="18"/>
+          <w:szCs w:val="18"/>
+          <w:lang w:val="es-ES"/>
+        </w:rPr>
+        <w:t>ta.</w:t>
       </w:r>
       <w:r>
         <w:rPr>
@@ -690,13 +724,23 @@
         </w:rPr>
         <w:t xml:space="preserve"> </w:t>
       </w:r>
-      <w:r>
-        <w:rPr>
-          <w:sz w:val="18"/>
-          <w:szCs w:val="18"/>
-          <w:lang w:val="es-ES"/>
-        </w:rPr>
-        <w:t>Marjorie Jaramillo</w:t>
+      <w:proofErr w:type="gramStart"/>
+      <w:r>
+        <w:rPr>
+          <w:sz w:val="18"/>
+          <w:szCs w:val="18"/>
+          <w:lang w:val="es-ES"/>
+        </w:rPr>
+        <w:t>{{ delegada</w:t>
+      </w:r>
+      <w:proofErr w:type="gramEnd"/>
+      <w:r>
+        <w:rPr>
+          <w:sz w:val="18"/>
+          <w:szCs w:val="18"/>
+          <w:lang w:val="es-ES"/>
+        </w:rPr>
+        <w:t xml:space="preserve"> }}</w:t>
       </w:r>
       <w:r>
         <w:rPr>
@@ -722,7 +766,6 @@
         </w:rPr>
         <w:t xml:space="preserve">de Servicios y Canales de la Agencia </w:t>
       </w:r>
-      <w:proofErr w:type="gramStart"/>
       <w:r>
         <w:t>{{</w:t>
       </w:r>
@@ -736,7 +779,6 @@
         </w:rPr>
         <w:t>provincia</w:t>
       </w:r>
-      <w:proofErr w:type="gramEnd"/>
       <w:r>
         <w:t xml:space="preserve"> </w:t>
       </w:r>
@@ -1170,6 +1212,7 @@
               </w:tcPr>
               <w:p>
                 <w:pPr>
+                  <w:jc w:val="center"/>
                   <w:rPr>
                     <w:sz w:val="18"/>
                     <w:szCs w:val="18"/>
@@ -1764,15 +1807,33 @@
                 <w:szCs w:val="18"/>
                 <w:lang w:val="es-ES"/>
               </w:rPr>
+              <w:t>Sr/</w:t>
+            </w:r>
+            <w:r>
+              <w:rPr>
+                <w:sz w:val="18"/>
+                <w:szCs w:val="18"/>
+                <w:lang w:val="es-ES"/>
+              </w:rPr>
               <w:t xml:space="preserve">Srta. </w:t>
             </w:r>
-            <w:r>
-              <w:rPr>
-                <w:sz w:val="18"/>
-                <w:szCs w:val="18"/>
-                <w:lang w:val="es-ES"/>
-              </w:rPr>
-              <w:t>Marjorie Jaramillo</w:t>
+            <w:proofErr w:type="gramStart"/>
+            <w:r>
+              <w:rPr>
+                <w:sz w:val="18"/>
+                <w:szCs w:val="18"/>
+                <w:lang w:val="es-ES"/>
+              </w:rPr>
+              <w:t>{{ delegada</w:t>
+            </w:r>
+            <w:proofErr w:type="gramEnd"/>
+            <w:r>
+              <w:rPr>
+                <w:sz w:val="18"/>
+                <w:szCs w:val="18"/>
+                <w:lang w:val="es-ES"/>
+              </w:rPr>
+              <w:t xml:space="preserve"> }}</w:t>
             </w:r>
           </w:p>
           <w:p>
@@ -1816,24 +1877,24 @@
               </w:rPr>
               <w:t xml:space="preserve"> de Servicios y Canales de la Agencia </w:t>
             </w:r>
-            <w:r>
-              <w:rPr>
-                <w:sz w:val="18"/>
-                <w:szCs w:val="18"/>
-                <w:lang w:val="es-ES"/>
-              </w:rPr>
-              <w:t xml:space="preserve">Pedro </w:t>
-            </w:r>
-            <w:proofErr w:type="spellStart"/>
-            <w:r>
-              <w:rPr>
-                <w:sz w:val="18"/>
-                <w:szCs w:val="18"/>
-                <w:lang w:val="es-ES"/>
-              </w:rPr>
-              <w:t>Carbo</w:t>
-            </w:r>
-            <w:proofErr w:type="spellEnd"/>
+            <w:proofErr w:type="gramStart"/>
+            <w:r>
+              <w:rPr>
+                <w:sz w:val="18"/>
+                <w:szCs w:val="18"/>
+                <w:lang w:val="es-ES"/>
+              </w:rPr>
+              <w:t>{{ provincia</w:t>
+            </w:r>
+            <w:proofErr w:type="gramEnd"/>
+            <w:r>
+              <w:rPr>
+                <w:sz w:val="18"/>
+                <w:szCs w:val="18"/>
+                <w:lang w:val="es-ES"/>
+              </w:rPr>
+              <w:t xml:space="preserve"> }}</w:t>
+            </w:r>
           </w:p>
           <w:p>
             <w:pPr>
@@ -3177,6 +3238,7 @@
     <w:rsid w:val="0044207A"/>
     <w:rsid w:val="00455DF8"/>
     <w:rsid w:val="004B1A59"/>
+    <w:rsid w:val="0062766A"/>
     <w:rsid w:val="0066354D"/>
     <w:rsid w:val="007773F1"/>
     <w:rsid w:val="007844D0"/>
@@ -3185,10 +3247,12 @@
     <w:rsid w:val="00825D09"/>
     <w:rsid w:val="00886C5C"/>
     <w:rsid w:val="0089699F"/>
+    <w:rsid w:val="009C59E2"/>
     <w:rsid w:val="009F0805"/>
     <w:rsid w:val="00A17184"/>
     <w:rsid w:val="00AF1CD2"/>
     <w:rsid w:val="00B5460A"/>
+    <w:rsid w:val="00B71B51"/>
     <w:rsid w:val="00C764C0"/>
     <w:rsid w:val="00CD1E9F"/>
     <w:rsid w:val="00CD7BD0"/>
@@ -3649,7 +3713,7 @@
     <w:basedOn w:val="Fuentedeprrafopredeter"/>
     <w:uiPriority w:val="99"/>
     <w:semiHidden/>
-    <w:rsid w:val="000F1811"/>
+    <w:rsid w:val="0062766A"/>
     <w:rPr>
       <w:color w:val="808080"/>
     </w:rPr>
@@ -3657,6 +3721,18 @@
   <w:style w:type="paragraph" w:customStyle="1" w:styleId="E8D53A35E6D242128A776A4C3101306B">
     <w:name w:val="E8D53A35E6D242128A776A4C3101306B"/>
     <w:rsid w:val="00364603"/>
+  </w:style>
+  <w:style w:type="paragraph" w:customStyle="1" w:styleId="0F4040BC0F3B4955904EDF249A11AA65">
+    <w:name w:val="0F4040BC0F3B4955904EDF249A11AA65"/>
+    <w:rsid w:val="0062766A"/>
+    <w:pPr>
+      <w:spacing w:line="278" w:lineRule="auto"/>
+    </w:pPr>
+    <w:rPr>
+      <w:sz w:val="24"/>
+      <w:szCs w:val="24"/>
+      <w:lang w:val="es-CO" w:eastAsia="es-CO"/>
+    </w:rPr>
   </w:style>
 </w:styles>
 </file>

</xml_diff>

<commit_message>
se agrega cedula por default cuando se seleciona nombre del tecnico
</commit_message>
<xml_diff>
--- a/plantilla.docx
+++ b/plantilla.docx
@@ -767,31 +767,44 @@
         <w:t xml:space="preserve">de Servicios y Canales de la Agencia </w:t>
       </w:r>
       <w:r>
-        <w:t>{{</w:t>
-      </w:r>
-      <w:r>
+        <w:rPr>
+          <w:sz w:val="18"/>
+          <w:szCs w:val="18"/>
+          <w:lang w:val="es-ES"/>
+        </w:rPr>
+        <w:t xml:space="preserve">{{ </w:t>
+      </w:r>
+      <w:r>
+        <w:rPr>
+          <w:sz w:val="18"/>
+          <w:szCs w:val="18"/>
+          <w:lang w:val="es-ES"/>
+        </w:rPr>
+        <w:t>provincia</w:t>
+      </w:r>
+      <w:r>
+        <w:rPr>
+          <w:sz w:val="18"/>
+          <w:szCs w:val="18"/>
+          <w:lang w:val="es-ES"/>
+        </w:rPr>
+        <w:t xml:space="preserve"> }}</w:t>
+      </w:r>
+      <w:r>
+        <w:rPr>
+          <w:sz w:val="18"/>
+          <w:szCs w:val="18"/>
+          <w:lang w:val="es-ES"/>
+        </w:rPr>
         <w:t xml:space="preserve"> </w:t>
       </w:r>
       <w:r>
         <w:rPr>
           <w:sz w:val="18"/>
           <w:szCs w:val="18"/>
-        </w:rPr>
-        <w:t>provincia</w:t>
-      </w:r>
-      <w:r>
-        <w:t xml:space="preserve"> </w:t>
-      </w:r>
-      <w:r>
-        <w:t>}}</w:t>
-      </w:r>
-      <w:r>
-        <w:rPr>
-          <w:sz w:val="18"/>
-          <w:szCs w:val="18"/>
-          <w:lang w:val="es-ES"/>
-        </w:rPr>
-        <w:t xml:space="preserve"> y por otra parte TECNOPLUS Cía. Ltda., representada por </w:t>
+          <w:lang w:val="es-ES"/>
+        </w:rPr>
+        <w:t xml:space="preserve">y por otra parte TECNOPLUS Cía. Ltda., representada por </w:t>
       </w:r>
       <w:r>
         <w:rPr>
@@ -845,24 +858,29 @@
       </w:r>
       <w:proofErr w:type="gramStart"/>
       <w:r>
-        <w:t>{{</w:t>
-      </w:r>
-      <w:r>
-        <w:t xml:space="preserve"> </w:t>
-      </w:r>
-      <w:r>
-        <w:rPr>
-          <w:sz w:val="18"/>
-          <w:szCs w:val="18"/>
+        <w:rPr>
+          <w:sz w:val="18"/>
+          <w:szCs w:val="18"/>
+          <w:lang w:val="es-ES"/>
+        </w:rPr>
+        <w:t xml:space="preserve">{{ </w:t>
+      </w:r>
+      <w:r>
+        <w:rPr>
+          <w:sz w:val="18"/>
+          <w:szCs w:val="18"/>
+          <w:lang w:val="es-ES"/>
         </w:rPr>
         <w:t>nombre</w:t>
       </w:r>
       <w:proofErr w:type="gramEnd"/>
       <w:r>
-        <w:t xml:space="preserve"> </w:t>
-      </w:r>
-      <w:r>
-        <w:t>}}</w:t>
+        <w:rPr>
+          <w:sz w:val="18"/>
+          <w:szCs w:val="18"/>
+          <w:lang w:val="es-ES"/>
+        </w:rPr>
+        <w:t xml:space="preserve"> }}</w:t>
       </w:r>
       <w:r>
         <w:rPr>
@@ -1627,20 +1645,29 @@
       </w:r>
       <w:proofErr w:type="gramStart"/>
       <w:r>
-        <w:t>{{</w:t>
-      </w:r>
-      <w:r>
-        <w:t xml:space="preserve"> </w:t>
-      </w:r>
-      <w:r>
+        <w:rPr>
+          <w:sz w:val="18"/>
+          <w:szCs w:val="18"/>
+          <w:lang w:val="es-ES"/>
+        </w:rPr>
+        <w:t xml:space="preserve">{{ </w:t>
+      </w:r>
+      <w:r>
+        <w:rPr>
+          <w:sz w:val="18"/>
+          <w:szCs w:val="18"/>
+          <w:lang w:val="es-ES"/>
+        </w:rPr>
         <w:t>problema</w:t>
       </w:r>
       <w:proofErr w:type="gramEnd"/>
       <w:r>
-        <w:t xml:space="preserve"> </w:t>
-      </w:r>
-      <w:r>
-        <w:t>}}</w:t>
+        <w:rPr>
+          <w:sz w:val="18"/>
+          <w:szCs w:val="18"/>
+          <w:lang w:val="es-ES"/>
+        </w:rPr>
+        <w:t xml:space="preserve"> }}</w:t>
       </w:r>
     </w:p>
     <w:p>
@@ -1867,7 +1894,23 @@
                 <w:szCs w:val="18"/>
                 <w:lang w:val="es-ES"/>
               </w:rPr>
+              <w:t>/o</w:t>
+            </w:r>
+            <w:r>
+              <w:rPr>
+                <w:sz w:val="18"/>
+                <w:szCs w:val="18"/>
+                <w:lang w:val="es-ES"/>
+              </w:rPr>
               <w:t xml:space="preserve"> encargada</w:t>
+            </w:r>
+            <w:r>
+              <w:rPr>
+                <w:sz w:val="18"/>
+                <w:szCs w:val="18"/>
+                <w:lang w:val="es-ES"/>
+              </w:rPr>
+              <w:t>/o</w:t>
             </w:r>
             <w:r>
               <w:rPr>
@@ -3238,6 +3281,7 @@
     <w:rsid w:val="0044207A"/>
     <w:rsid w:val="00455DF8"/>
     <w:rsid w:val="004B1A59"/>
+    <w:rsid w:val="004E3EB8"/>
     <w:rsid w:val="0062766A"/>
     <w:rsid w:val="0066354D"/>
     <w:rsid w:val="007773F1"/>
@@ -3247,6 +3291,7 @@
     <w:rsid w:val="00825D09"/>
     <w:rsid w:val="00886C5C"/>
     <w:rsid w:val="0089699F"/>
+    <w:rsid w:val="009C2603"/>
     <w:rsid w:val="009C59E2"/>
     <w:rsid w:val="009F0805"/>
     <w:rsid w:val="00A17184"/>
@@ -3722,18 +3767,6 @@
     <w:name w:val="E8D53A35E6D242128A776A4C3101306B"/>
     <w:rsid w:val="00364603"/>
   </w:style>
-  <w:style w:type="paragraph" w:customStyle="1" w:styleId="0F4040BC0F3B4955904EDF249A11AA65">
-    <w:name w:val="0F4040BC0F3B4955904EDF249A11AA65"/>
-    <w:rsid w:val="0062766A"/>
-    <w:pPr>
-      <w:spacing w:line="278" w:lineRule="auto"/>
-    </w:pPr>
-    <w:rPr>
-      <w:sz w:val="24"/>
-      <w:szCs w:val="24"/>
-      <w:lang w:val="es-CO" w:eastAsia="es-CO"/>
-    </w:rPr>
-  </w:style>
 </w:styles>
 </file>
 

</xml_diff>

<commit_message>
se agrega parametros para recibir el dato de cedula
</commit_message>
<xml_diff>
--- a/plantilla.docx
+++ b/plantilla.docx
@@ -521,7 +521,6 @@
                 <w:szCs w:val="18"/>
               </w:rPr>
             </w:pPr>
-            <w:proofErr w:type="gramStart"/>
             <w:r>
               <w:t>{{</w:t>
             </w:r>
@@ -537,7 +536,6 @@
               </w:rPr>
               <w:t>fecha</w:t>
             </w:r>
-            <w:proofErr w:type="gramEnd"/>
             <w:r>
               <w:rPr>
                 <w:b/>
@@ -724,23 +722,13 @@
         </w:rPr>
         <w:t xml:space="preserve"> </w:t>
       </w:r>
-      <w:proofErr w:type="gramStart"/>
-      <w:r>
-        <w:rPr>
-          <w:sz w:val="18"/>
-          <w:szCs w:val="18"/>
-          <w:lang w:val="es-ES"/>
-        </w:rPr>
-        <w:t>{{ delegada</w:t>
-      </w:r>
-      <w:proofErr w:type="gramEnd"/>
-      <w:r>
-        <w:rPr>
-          <w:sz w:val="18"/>
-          <w:szCs w:val="18"/>
-          <w:lang w:val="es-ES"/>
-        </w:rPr>
-        <w:t xml:space="preserve"> }}</w:t>
+      <w:r>
+        <w:rPr>
+          <w:sz w:val="18"/>
+          <w:szCs w:val="18"/>
+          <w:lang w:val="es-ES"/>
+        </w:rPr>
+        <w:t>{{ delegada }}</w:t>
       </w:r>
       <w:r>
         <w:rPr>
@@ -856,7 +844,6 @@
         </w:rPr>
         <w:t xml:space="preserve">El servicio fue realizado por el técnico </w:t>
       </w:r>
-      <w:proofErr w:type="gramStart"/>
       <w:r>
         <w:rPr>
           <w:sz w:val="18"/>
@@ -873,7 +860,6 @@
         </w:rPr>
         <w:t>nombre</w:t>
       </w:r>
-      <w:proofErr w:type="gramEnd"/>
       <w:r>
         <w:rPr>
           <w:sz w:val="18"/>
@@ -912,7 +898,23 @@
           <w:szCs w:val="18"/>
           <w:lang w:val="es-ES"/>
         </w:rPr>
-        <w:t>1312316811</w:t>
+        <w:t xml:space="preserve">{{ </w:t>
+      </w:r>
+      <w:r>
+        <w:rPr>
+          <w:sz w:val="18"/>
+          <w:szCs w:val="18"/>
+          <w:lang w:val="es-ES"/>
+        </w:rPr>
+        <w:t>cedula</w:t>
+      </w:r>
+      <w:r>
+        <w:rPr>
+          <w:sz w:val="18"/>
+          <w:szCs w:val="18"/>
+          <w:lang w:val="es-ES"/>
+        </w:rPr>
+        <w:t xml:space="preserve"> }}</w:t>
       </w:r>
       <w:r>
         <w:rPr>
@@ -1237,7 +1239,6 @@
                     <w:lang w:val="es-ES"/>
                   </w:rPr>
                 </w:pPr>
-                <w:proofErr w:type="gramStart"/>
                 <w:r>
                   <w:rPr>
                     <w:b/>
@@ -1245,17 +1246,7 @@
                     <w:kern w:val="0"/>
                     <w14:ligatures w14:val="none"/>
                   </w:rPr>
-                  <w:t>{{ provincia</w:t>
-                </w:r>
-                <w:proofErr w:type="gramEnd"/>
-                <w:r>
-                  <w:rPr>
-                    <w:b/>
-                    <w:bCs/>
-                    <w:kern w:val="0"/>
-                    <w14:ligatures w14:val="none"/>
-                  </w:rPr>
-                  <w:t xml:space="preserve"> }}</w:t>
+                  <w:t>{{ provincia }}</w:t>
                 </w:r>
               </w:p>
             </w:tc>
@@ -1643,7 +1634,6 @@
         </w:rPr>
         <w:t xml:space="preserve"> </w:t>
       </w:r>
-      <w:proofErr w:type="gramStart"/>
       <w:r>
         <w:rPr>
           <w:sz w:val="18"/>
@@ -1660,7 +1650,6 @@
         </w:rPr>
         <w:t>problema</w:t>
       </w:r>
-      <w:proofErr w:type="gramEnd"/>
       <w:r>
         <w:rPr>
           <w:sz w:val="18"/>
@@ -1844,23 +1833,13 @@
               </w:rPr>
               <w:t xml:space="preserve">Srta. </w:t>
             </w:r>
-            <w:proofErr w:type="gramStart"/>
-            <w:r>
-              <w:rPr>
-                <w:sz w:val="18"/>
-                <w:szCs w:val="18"/>
-                <w:lang w:val="es-ES"/>
-              </w:rPr>
-              <w:t>{{ delegada</w:t>
-            </w:r>
-            <w:proofErr w:type="gramEnd"/>
-            <w:r>
-              <w:rPr>
-                <w:sz w:val="18"/>
-                <w:szCs w:val="18"/>
-                <w:lang w:val="es-ES"/>
-              </w:rPr>
-              <w:t xml:space="preserve"> }}</w:t>
+            <w:r>
+              <w:rPr>
+                <w:sz w:val="18"/>
+                <w:szCs w:val="18"/>
+                <w:lang w:val="es-ES"/>
+              </w:rPr>
+              <w:t>{{ delegada }}</w:t>
             </w:r>
           </w:p>
           <w:p>
@@ -1920,23 +1899,13 @@
               </w:rPr>
               <w:t xml:space="preserve"> de Servicios y Canales de la Agencia </w:t>
             </w:r>
-            <w:proofErr w:type="gramStart"/>
-            <w:r>
-              <w:rPr>
-                <w:sz w:val="18"/>
-                <w:szCs w:val="18"/>
-                <w:lang w:val="es-ES"/>
-              </w:rPr>
-              <w:t>{{ provincia</w:t>
-            </w:r>
-            <w:proofErr w:type="gramEnd"/>
-            <w:r>
-              <w:rPr>
-                <w:sz w:val="18"/>
-                <w:szCs w:val="18"/>
-                <w:lang w:val="es-ES"/>
-              </w:rPr>
-              <w:t xml:space="preserve"> }}</w:t>
+            <w:r>
+              <w:rPr>
+                <w:sz w:val="18"/>
+                <w:szCs w:val="18"/>
+                <w:lang w:val="es-ES"/>
+              </w:rPr>
+              <w:t>{{ provincia }}</w:t>
             </w:r>
           </w:p>
           <w:p>
@@ -3282,8 +3251,10 @@
     <w:rsid w:val="00455DF8"/>
     <w:rsid w:val="004B1A59"/>
     <w:rsid w:val="004E3EB8"/>
+    <w:rsid w:val="005979D5"/>
     <w:rsid w:val="0062766A"/>
     <w:rsid w:val="0066354D"/>
+    <w:rsid w:val="006A2BA4"/>
     <w:rsid w:val="007773F1"/>
     <w:rsid w:val="007844D0"/>
     <w:rsid w:val="007D5E00"/>

</xml_diff>

<commit_message>
se introduce serie y modelo, tablas
</commit_message>
<xml_diff>
--- a/plantilla.docx
+++ b/plantilla.docx
@@ -521,6 +521,7 @@
                 <w:szCs w:val="18"/>
               </w:rPr>
             </w:pPr>
+            <w:proofErr w:type="gramStart"/>
             <w:r>
               <w:t>{{</w:t>
             </w:r>
@@ -536,6 +537,7 @@
               </w:rPr>
               <w:t>fecha</w:t>
             </w:r>
+            <w:proofErr w:type="gramEnd"/>
             <w:r>
               <w:rPr>
                 <w:b/>
@@ -722,13 +724,23 @@
         </w:rPr>
         <w:t xml:space="preserve"> </w:t>
       </w:r>
-      <w:r>
-        <w:rPr>
-          <w:sz w:val="18"/>
-          <w:szCs w:val="18"/>
-          <w:lang w:val="es-ES"/>
-        </w:rPr>
-        <w:t>{{ delegada }}</w:t>
+      <w:proofErr w:type="gramStart"/>
+      <w:r>
+        <w:rPr>
+          <w:sz w:val="18"/>
+          <w:szCs w:val="18"/>
+          <w:lang w:val="es-ES"/>
+        </w:rPr>
+        <w:t>{{ delegada</w:t>
+      </w:r>
+      <w:proofErr w:type="gramEnd"/>
+      <w:r>
+        <w:rPr>
+          <w:sz w:val="18"/>
+          <w:szCs w:val="18"/>
+          <w:lang w:val="es-ES"/>
+        </w:rPr>
+        <w:t xml:space="preserve"> }}</w:t>
       </w:r>
       <w:r>
         <w:rPr>
@@ -844,6 +856,7 @@
         </w:rPr>
         <w:t xml:space="preserve">El servicio fue realizado por el técnico </w:t>
       </w:r>
+      <w:proofErr w:type="gramStart"/>
       <w:r>
         <w:rPr>
           <w:sz w:val="18"/>
@@ -860,6 +873,7 @@
         </w:rPr>
         <w:t>nombre</w:t>
       </w:r>
+      <w:proofErr w:type="gramEnd"/>
       <w:r>
         <w:rPr>
           <w:sz w:val="18"/>
@@ -1227,7 +1241,6 @@
             <w:tc>
               <w:tcPr>
                 <w:tcW w:w="1765" w:type="dxa"/>
-                <w:vMerge w:val="restart"/>
                 <w:vAlign w:val="center"/>
               </w:tcPr>
               <w:p>
@@ -1239,6 +1252,7 @@
                     <w:lang w:val="es-ES"/>
                   </w:rPr>
                 </w:pPr>
+                <w:proofErr w:type="gramStart"/>
                 <w:r>
                   <w:rPr>
                     <w:b/>
@@ -1246,7 +1260,17 @@
                     <w:kern w:val="0"/>
                     <w14:ligatures w14:val="none"/>
                   </w:rPr>
-                  <w:t>{{ provincia }}</w:t>
+                  <w:t>{{ provincia</w:t>
+                </w:r>
+                <w:proofErr w:type="gramEnd"/>
+                <w:r>
+                  <w:rPr>
+                    <w:b/>
+                    <w:bCs/>
+                    <w:kern w:val="0"/>
+                    <w14:ligatures w14:val="none"/>
+                  </w:rPr>
+                  <w:t xml:space="preserve"> }}</w:t>
                 </w:r>
               </w:p>
             </w:tc>
@@ -1255,7 +1279,6 @@
         <w:tc>
           <w:tcPr>
             <w:tcW w:w="1770" w:type="dxa"/>
-            <w:vMerge w:val="restart"/>
             <w:vAlign w:val="center"/>
           </w:tcPr>
           <w:p>
@@ -1273,7 +1296,43 @@
                 <w:szCs w:val="18"/>
                 <w:lang w:val="es-ES"/>
               </w:rPr>
-              <w:t>Impresoras Financiera</w:t>
+              <w:t xml:space="preserve">{% </w:t>
+            </w:r>
+            <w:proofErr w:type="spellStart"/>
+            <w:r>
+              <w:rPr>
+                <w:sz w:val="18"/>
+                <w:szCs w:val="18"/>
+                <w:lang w:val="es-ES"/>
+              </w:rPr>
+              <w:t>for</w:t>
+            </w:r>
+            <w:proofErr w:type="spellEnd"/>
+            <w:r>
+              <w:rPr>
+                <w:sz w:val="18"/>
+                <w:szCs w:val="18"/>
+                <w:lang w:val="es-ES"/>
+              </w:rPr>
+              <w:t xml:space="preserve"> serie in series </w:t>
+            </w:r>
+            <w:proofErr w:type="gramStart"/>
+            <w:r>
+              <w:rPr>
+                <w:sz w:val="18"/>
+                <w:szCs w:val="18"/>
+                <w:lang w:val="es-ES"/>
+              </w:rPr>
+              <w:t>%}Impresora</w:t>
+            </w:r>
+            <w:proofErr w:type="gramEnd"/>
+            <w:r>
+              <w:rPr>
+                <w:sz w:val="18"/>
+                <w:szCs w:val="18"/>
+                <w:lang w:val="es-ES"/>
+              </w:rPr>
+              <w:t xml:space="preserve"> Financiera</w:t>
             </w:r>
           </w:p>
         </w:tc>
@@ -1283,19 +1342,30 @@
           </w:tcPr>
           <w:p>
             <w:pPr>
-              <w:rPr>
-                <w:sz w:val="18"/>
-                <w:szCs w:val="18"/>
-                <w:lang w:val="es-ES"/>
-              </w:rPr>
-            </w:pPr>
-            <w:r>
-              <w:rPr>
-                <w:sz w:val="18"/>
-                <w:szCs w:val="18"/>
-                <w:lang w:val="es-ES"/>
-              </w:rPr>
-              <w:t>TM-H6000V</w:t>
+              <w:jc w:val="center"/>
+              <w:rPr>
+                <w:sz w:val="18"/>
+                <w:szCs w:val="18"/>
+                <w:lang w:val="es-ES"/>
+              </w:rPr>
+            </w:pPr>
+            <w:proofErr w:type="gramStart"/>
+            <w:r>
+              <w:rPr>
+                <w:sz w:val="18"/>
+                <w:szCs w:val="18"/>
+                <w:lang w:val="es-ES"/>
+              </w:rPr>
+              <w:t>{{ modelo</w:t>
+            </w:r>
+            <w:proofErr w:type="gramEnd"/>
+            <w:r>
+              <w:rPr>
+                <w:sz w:val="18"/>
+                <w:szCs w:val="18"/>
+                <w:lang w:val="es-ES"/>
+              </w:rPr>
+              <w:t xml:space="preserve"> }}</w:t>
             </w:r>
           </w:p>
         </w:tc>
@@ -1305,177 +1375,76 @@
           </w:tcPr>
           <w:p>
             <w:pPr>
-              <w:rPr>
-                <w:sz w:val="18"/>
-                <w:szCs w:val="18"/>
-                <w:lang w:val="es-ES"/>
-              </w:rPr>
-            </w:pPr>
-            <w:r>
-              <w:rPr>
-                <w:sz w:val="18"/>
-                <w:szCs w:val="18"/>
-                <w:lang w:val="es-ES"/>
-              </w:rPr>
-              <w:t>X83P016645</w:t>
-            </w:r>
-          </w:p>
-        </w:tc>
-      </w:tr>
-      <w:tr>
-        <w:trPr>
-          <w:trHeight w:val="50"/>
-        </w:trPr>
-        <w:tc>
-          <w:tcPr>
-            <w:tcW w:w="1765" w:type="dxa"/>
-            <w:vMerge/>
-          </w:tcPr>
-          <w:p>
-            <w:pPr>
-              <w:rPr>
-                <w:sz w:val="18"/>
-                <w:szCs w:val="18"/>
-                <w:lang w:val="es-ES"/>
-              </w:rPr>
-            </w:pPr>
-          </w:p>
-        </w:tc>
-        <w:tc>
-          <w:tcPr>
-            <w:tcW w:w="1770" w:type="dxa"/>
-            <w:vMerge/>
-          </w:tcPr>
-          <w:p>
-            <w:pPr>
-              <w:rPr>
-                <w:sz w:val="18"/>
-                <w:szCs w:val="18"/>
-                <w:lang w:val="es-ES"/>
-              </w:rPr>
-            </w:pPr>
-          </w:p>
-        </w:tc>
-        <w:tc>
-          <w:tcPr>
-            <w:tcW w:w="1761" w:type="dxa"/>
-          </w:tcPr>
-          <w:p>
-            <w:pPr>
-              <w:rPr>
-                <w:sz w:val="18"/>
-                <w:szCs w:val="18"/>
-                <w:lang w:val="es-ES"/>
-              </w:rPr>
-            </w:pPr>
-            <w:r>
-              <w:rPr>
-                <w:sz w:val="18"/>
-                <w:szCs w:val="18"/>
-                <w:lang w:val="es-ES"/>
-              </w:rPr>
-              <w:t>TM-H6000V</w:t>
-            </w:r>
-          </w:p>
-        </w:tc>
-        <w:tc>
-          <w:tcPr>
-            <w:tcW w:w="2325" w:type="dxa"/>
-          </w:tcPr>
-          <w:p>
-            <w:pPr>
-              <w:rPr>
-                <w:sz w:val="18"/>
-                <w:szCs w:val="18"/>
-                <w:lang w:val="es-ES"/>
-              </w:rPr>
-            </w:pPr>
-            <w:r>
-              <w:rPr>
-                <w:sz w:val="18"/>
-                <w:szCs w:val="18"/>
-                <w:lang w:val="es-ES"/>
-              </w:rPr>
-              <w:t>X83P016545</w:t>
-            </w:r>
-          </w:p>
-        </w:tc>
-      </w:tr>
-      <w:tr>
-        <w:trPr>
-          <w:trHeight w:val="300"/>
-        </w:trPr>
-        <w:tc>
-          <w:tcPr>
-            <w:tcW w:w="1765" w:type="dxa"/>
-            <w:vMerge/>
-          </w:tcPr>
-          <w:p>
-            <w:pPr>
-              <w:rPr>
-                <w:sz w:val="18"/>
-                <w:szCs w:val="18"/>
-                <w:lang w:val="es-ES"/>
-              </w:rPr>
-            </w:pPr>
-          </w:p>
-        </w:tc>
-        <w:tc>
-          <w:tcPr>
-            <w:tcW w:w="1770" w:type="dxa"/>
-            <w:vMerge/>
-          </w:tcPr>
-          <w:p>
-            <w:pPr>
-              <w:rPr>
-                <w:sz w:val="18"/>
-                <w:szCs w:val="18"/>
-                <w:lang w:val="es-ES"/>
-              </w:rPr>
-            </w:pPr>
-          </w:p>
-        </w:tc>
-        <w:tc>
-          <w:tcPr>
-            <w:tcW w:w="1761" w:type="dxa"/>
-          </w:tcPr>
-          <w:p>
-            <w:pPr>
-              <w:rPr>
-                <w:sz w:val="18"/>
-                <w:szCs w:val="18"/>
-                <w:lang w:val="es-ES"/>
-              </w:rPr>
-            </w:pPr>
-            <w:r>
-              <w:rPr>
-                <w:sz w:val="18"/>
-                <w:szCs w:val="18"/>
-                <w:lang w:val="es-ES"/>
-              </w:rPr>
-              <w:t>TM-H6000V</w:t>
-            </w:r>
-          </w:p>
-        </w:tc>
-        <w:tc>
-          <w:tcPr>
-            <w:tcW w:w="2325" w:type="dxa"/>
-          </w:tcPr>
-          <w:p>
-            <w:pPr>
-              <w:rPr>
-                <w:sz w:val="18"/>
-                <w:szCs w:val="18"/>
-                <w:lang w:val="es-ES"/>
-              </w:rPr>
-            </w:pPr>
-            <w:r>
-              <w:rPr>
-                <w:sz w:val="18"/>
-                <w:szCs w:val="18"/>
-                <w:lang w:val="es-ES"/>
-              </w:rPr>
-              <w:t>X83P015974</w:t>
+              <w:jc w:val="center"/>
+              <w:rPr>
+                <w:sz w:val="18"/>
+                <w:szCs w:val="18"/>
+                <w:lang w:val="es-ES"/>
+              </w:rPr>
+            </w:pPr>
+            <w:proofErr w:type="gramStart"/>
+            <w:r>
+              <w:rPr>
+                <w:sz w:val="18"/>
+                <w:szCs w:val="18"/>
+                <w:lang w:val="es-ES"/>
+              </w:rPr>
+              <w:t>{{ serie</w:t>
+            </w:r>
+            <w:proofErr w:type="gramEnd"/>
+            <w:r>
+              <w:rPr>
+                <w:sz w:val="18"/>
+                <w:szCs w:val="18"/>
+                <w:lang w:val="es-ES"/>
+              </w:rPr>
+              <w:t xml:space="preserve"> }}</w:t>
+            </w:r>
+          </w:p>
+          <w:p>
+            <w:pPr>
+              <w:jc w:val="center"/>
+              <w:rPr>
+                <w:sz w:val="18"/>
+                <w:szCs w:val="18"/>
+                <w:lang w:val="es-ES"/>
+              </w:rPr>
+            </w:pPr>
+          </w:p>
+          <w:p>
+            <w:pPr>
+              <w:jc w:val="center"/>
+              <w:rPr>
+                <w:sz w:val="18"/>
+                <w:szCs w:val="18"/>
+                <w:lang w:val="es-ES"/>
+              </w:rPr>
+            </w:pPr>
+            <w:r>
+              <w:rPr>
+                <w:sz w:val="18"/>
+                <w:szCs w:val="18"/>
+                <w:lang w:val="es-ES"/>
+              </w:rPr>
+              <w:t xml:space="preserve">{% </w:t>
+            </w:r>
+            <w:proofErr w:type="spellStart"/>
+            <w:r>
+              <w:rPr>
+                <w:sz w:val="18"/>
+                <w:szCs w:val="18"/>
+                <w:lang w:val="es-ES"/>
+              </w:rPr>
+              <w:t>endfor</w:t>
+            </w:r>
+            <w:proofErr w:type="spellEnd"/>
+            <w:r>
+              <w:rPr>
+                <w:sz w:val="18"/>
+                <w:szCs w:val="18"/>
+                <w:lang w:val="es-ES"/>
+              </w:rPr>
+              <w:t xml:space="preserve"> %}</w:t>
             </w:r>
           </w:p>
         </w:tc>
@@ -1634,6 +1603,7 @@
         </w:rPr>
         <w:t xml:space="preserve"> </w:t>
       </w:r>
+      <w:proofErr w:type="gramStart"/>
       <w:r>
         <w:rPr>
           <w:sz w:val="18"/>
@@ -1650,6 +1620,7 @@
         </w:rPr>
         <w:t>problema</w:t>
       </w:r>
+      <w:proofErr w:type="gramEnd"/>
       <w:r>
         <w:rPr>
           <w:sz w:val="18"/>
@@ -1833,13 +1804,23 @@
               </w:rPr>
               <w:t xml:space="preserve">Srta. </w:t>
             </w:r>
-            <w:r>
-              <w:rPr>
-                <w:sz w:val="18"/>
-                <w:szCs w:val="18"/>
-                <w:lang w:val="es-ES"/>
-              </w:rPr>
-              <w:t>{{ delegada }}</w:t>
+            <w:proofErr w:type="gramStart"/>
+            <w:r>
+              <w:rPr>
+                <w:sz w:val="18"/>
+                <w:szCs w:val="18"/>
+                <w:lang w:val="es-ES"/>
+              </w:rPr>
+              <w:t>{{ delegada</w:t>
+            </w:r>
+            <w:proofErr w:type="gramEnd"/>
+            <w:r>
+              <w:rPr>
+                <w:sz w:val="18"/>
+                <w:szCs w:val="18"/>
+                <w:lang w:val="es-ES"/>
+              </w:rPr>
+              <w:t xml:space="preserve"> }}</w:t>
             </w:r>
           </w:p>
           <w:p>
@@ -1899,13 +1880,23 @@
               </w:rPr>
               <w:t xml:space="preserve"> de Servicios y Canales de la Agencia </w:t>
             </w:r>
-            <w:r>
-              <w:rPr>
-                <w:sz w:val="18"/>
-                <w:szCs w:val="18"/>
-                <w:lang w:val="es-ES"/>
-              </w:rPr>
-              <w:t>{{ provincia }}</w:t>
+            <w:proofErr w:type="gramStart"/>
+            <w:r>
+              <w:rPr>
+                <w:sz w:val="18"/>
+                <w:szCs w:val="18"/>
+                <w:lang w:val="es-ES"/>
+              </w:rPr>
+              <w:t>{{ provincia</w:t>
+            </w:r>
+            <w:proofErr w:type="gramEnd"/>
+            <w:r>
+              <w:rPr>
+                <w:sz w:val="18"/>
+                <w:szCs w:val="18"/>
+                <w:lang w:val="es-ES"/>
+              </w:rPr>
+              <w:t xml:space="preserve"> }}</w:t>
             </w:r>
           </w:p>
           <w:p>
@@ -3273,6 +3264,8 @@
     <w:rsid w:val="00CD1E9F"/>
     <w:rsid w:val="00CD7BD0"/>
     <w:rsid w:val="00D32320"/>
+    <w:rsid w:val="00E141B4"/>
+    <w:rsid w:val="00F23CB0"/>
     <w:rsid w:val="00F87258"/>
   </w:rsids>
   <m:mathPr>

</xml_diff>

<commit_message>
actualziacion de tablas y plantilla de word
</commit_message>
<xml_diff>
--- a/plantilla.docx
+++ b/plantilla.docx
@@ -31,17 +31,7 @@
           <w:sz w:val="16"/>
           <w:szCs w:val="16"/>
         </w:rPr>
-        <w:t>QUINT</w:t>
-      </w:r>
-      <w:r>
-        <w:rPr>
-          <w:rFonts w:ascii="Arial" w:hAnsi="Arial" w:cs="Arial"/>
-          <w:b/>
-          <w:bCs/>
-          <w:sz w:val="16"/>
-          <w:szCs w:val="16"/>
-        </w:rPr>
-        <w:t>O</w:t>
+        <w:t>SEXTO</w:t>
       </w:r>
       <w:r>
         <w:rPr>
@@ -284,7 +274,23 @@
                 <w:sz w:val="16"/>
                 <w:szCs w:val="16"/>
               </w:rPr>
-              <w:t>ADQUISICION DE IMPRESORAS FINACIERAS PARA LAS DIFERENTES OFICINAS DE BANECUADOR B.P.</w:t>
+              <w:t>ADQUISICION DE IMPRESORAS FINA</w:t>
+            </w:r>
+            <w:r>
+              <w:rPr>
+                <w:rFonts w:cstheme="minorHAnsi"/>
+                <w:sz w:val="16"/>
+                <w:szCs w:val="16"/>
+              </w:rPr>
+              <w:t>N</w:t>
+            </w:r>
+            <w:r>
+              <w:rPr>
+                <w:rFonts w:cstheme="minorHAnsi"/>
+                <w:sz w:val="16"/>
+                <w:szCs w:val="16"/>
+              </w:rPr>
+              <w:t>CIERAS PARA LAS DIFERENTES OFICINAS DE BANECUADOR B.P.</w:t>
             </w:r>
           </w:p>
         </w:tc>
@@ -446,7 +452,7 @@
                 <w:sz w:val="18"/>
                 <w:szCs w:val="18"/>
               </w:rPr>
-              <w:t>Quinto</w:t>
+              <w:t>Sexto</w:t>
             </w:r>
             <w:r>
               <w:rPr>
@@ -521,7 +527,6 @@
                 <w:szCs w:val="18"/>
               </w:rPr>
             </w:pPr>
-            <w:proofErr w:type="gramStart"/>
             <w:r>
               <w:t>{{</w:t>
             </w:r>
@@ -537,7 +542,6 @@
               </w:rPr>
               <w:t>fecha</w:t>
             </w:r>
-            <w:proofErr w:type="gramEnd"/>
             <w:r>
               <w:rPr>
                 <w:b/>
@@ -724,39 +728,37 @@
         </w:rPr>
         <w:t xml:space="preserve"> </w:t>
       </w:r>
-      <w:proofErr w:type="gramStart"/>
-      <w:r>
-        <w:rPr>
-          <w:sz w:val="18"/>
-          <w:szCs w:val="18"/>
-          <w:lang w:val="es-ES"/>
-        </w:rPr>
-        <w:t>{{ delegada</w:t>
-      </w:r>
-      <w:proofErr w:type="gramEnd"/>
-      <w:r>
-        <w:rPr>
-          <w:sz w:val="18"/>
-          <w:szCs w:val="18"/>
-          <w:lang w:val="es-ES"/>
-        </w:rPr>
-        <w:t xml:space="preserve"> }}</w:t>
-      </w:r>
-      <w:r>
-        <w:rPr>
-          <w:sz w:val="18"/>
-          <w:szCs w:val="18"/>
-          <w:lang w:val="es-ES"/>
-        </w:rPr>
-        <w:t xml:space="preserve">, en calidad de delegada </w:t>
-      </w:r>
-      <w:r>
-        <w:rPr>
-          <w:sz w:val="18"/>
-          <w:szCs w:val="18"/>
-          <w:lang w:val="es-ES"/>
-        </w:rPr>
-        <w:t xml:space="preserve">encargada </w:t>
+      <w:r>
+        <w:rPr>
+          <w:sz w:val="18"/>
+          <w:szCs w:val="18"/>
+          <w:lang w:val="es-ES"/>
+        </w:rPr>
+        <w:t>{{ delegada }}</w:t>
+      </w:r>
+      <w:r>
+        <w:rPr>
+          <w:sz w:val="18"/>
+          <w:szCs w:val="18"/>
+          <w:lang w:val="es-ES"/>
+        </w:rPr>
+        <w:t>, en calidad de delegada</w:t>
+      </w:r>
+      <w:r>
+        <w:rPr>
+          <w:sz w:val="18"/>
+          <w:szCs w:val="18"/>
+          <w:lang w:val="es-ES"/>
+        </w:rPr>
+        <w:t>/o</w:t>
+      </w:r>
+      <w:r>
+        <w:rPr>
+          <w:sz w:val="18"/>
+          <w:szCs w:val="18"/>
+          <w:lang w:val="es-ES"/>
+        </w:rPr>
+        <w:t xml:space="preserve"> </w:t>
       </w:r>
       <w:r>
         <w:rPr>
@@ -856,7 +858,6 @@
         </w:rPr>
         <w:t xml:space="preserve">El servicio fue realizado por el técnico </w:t>
       </w:r>
-      <w:proofErr w:type="gramStart"/>
       <w:r>
         <w:rPr>
           <w:sz w:val="18"/>
@@ -873,7 +874,6 @@
         </w:rPr>
         <w:t>nombre</w:t>
       </w:r>
-      <w:proofErr w:type="gramEnd"/>
       <w:r>
         <w:rPr>
           <w:sz w:val="18"/>
@@ -994,15 +994,7 @@
           <w:szCs w:val="18"/>
           <w:lang w:val="es-ES"/>
         </w:rPr>
-        <w:t>QUINT</w:t>
-      </w:r>
-      <w:r>
-        <w:rPr>
-          <w:sz w:val="18"/>
-          <w:szCs w:val="18"/>
-          <w:lang w:val="es-ES"/>
-        </w:rPr>
-        <w:t>O</w:t>
+        <w:t>SEXTO</w:t>
       </w:r>
       <w:r>
         <w:rPr>
@@ -1243,25 +1235,7 @@
                 <w:szCs w:val="18"/>
                 <w:lang w:val="es-ES"/>
               </w:rPr>
-              <w:t xml:space="preserve">{% </w:t>
-            </w:r>
-            <w:proofErr w:type="spellStart"/>
-            <w:r>
-              <w:rPr>
-                <w:sz w:val="18"/>
-                <w:szCs w:val="18"/>
-                <w:lang w:val="es-ES"/>
-              </w:rPr>
-              <w:t>for</w:t>
-            </w:r>
-            <w:proofErr w:type="spellEnd"/>
-            <w:r>
-              <w:rPr>
-                <w:sz w:val="18"/>
-                <w:szCs w:val="18"/>
-                <w:lang w:val="es-ES"/>
-              </w:rPr>
-              <w:t xml:space="preserve"> serie in series %}</w:t>
+              <w:t>{% for serie in series%}</w:t>
             </w:r>
           </w:p>
         </w:tc>
@@ -1329,27 +1303,15 @@
                 <w:lang w:val="es-ES"/>
               </w:rPr>
             </w:pPr>
-            <w:proofErr w:type="gramStart"/>
-            <w:r>
-              <w:rPr>
-                <w:b/>
-                <w:bCs/>
-                <w:sz w:val="18"/>
-                <w:szCs w:val="18"/>
-                <w:lang w:val="es-ES"/>
-              </w:rPr>
-              <w:t>{{ provincia</w:t>
-            </w:r>
-            <w:proofErr w:type="gramEnd"/>
-            <w:r>
-              <w:rPr>
-                <w:b/>
-                <w:bCs/>
-                <w:sz w:val="18"/>
-                <w:szCs w:val="18"/>
-                <w:lang w:val="es-ES"/>
-              </w:rPr>
-              <w:t xml:space="preserve"> }}</w:t>
+            <w:r>
+              <w:rPr>
+                <w:b/>
+                <w:bCs/>
+                <w:sz w:val="18"/>
+                <w:szCs w:val="18"/>
+                <w:lang w:val="es-ES"/>
+              </w:rPr>
+              <w:t>{{ provincia }}</w:t>
             </w:r>
           </w:p>
         </w:tc>
@@ -1390,23 +1352,13 @@
                 <w:lang w:val="es-ES"/>
               </w:rPr>
             </w:pPr>
-            <w:proofErr w:type="gramStart"/>
-            <w:r>
-              <w:rPr>
-                <w:sz w:val="18"/>
-                <w:szCs w:val="18"/>
-                <w:lang w:val="es-ES"/>
-              </w:rPr>
-              <w:t>{{ modelo</w:t>
-            </w:r>
-            <w:proofErr w:type="gramEnd"/>
-            <w:r>
-              <w:rPr>
-                <w:sz w:val="18"/>
-                <w:szCs w:val="18"/>
-                <w:lang w:val="es-ES"/>
-              </w:rPr>
-              <w:t xml:space="preserve"> }}</w:t>
+            <w:r>
+              <w:rPr>
+                <w:sz w:val="18"/>
+                <w:szCs w:val="18"/>
+                <w:lang w:val="es-ES"/>
+              </w:rPr>
+              <w:t>{{ modelo }}</w:t>
             </w:r>
           </w:p>
         </w:tc>
@@ -1423,23 +1375,13 @@
                 <w:lang w:val="es-ES"/>
               </w:rPr>
             </w:pPr>
-            <w:proofErr w:type="gramStart"/>
-            <w:r>
-              <w:rPr>
-                <w:sz w:val="18"/>
-                <w:szCs w:val="18"/>
-                <w:lang w:val="es-ES"/>
-              </w:rPr>
-              <w:t>{{ serie</w:t>
-            </w:r>
-            <w:proofErr w:type="gramEnd"/>
-            <w:r>
-              <w:rPr>
-                <w:sz w:val="18"/>
-                <w:szCs w:val="18"/>
-                <w:lang w:val="es-ES"/>
-              </w:rPr>
-              <w:t xml:space="preserve"> }}</w:t>
+            <w:r>
+              <w:rPr>
+                <w:sz w:val="18"/>
+                <w:szCs w:val="18"/>
+                <w:lang w:val="es-ES"/>
+              </w:rPr>
+              <w:t>{{ serie }}</w:t>
             </w:r>
           </w:p>
         </w:tc>
@@ -1465,25 +1407,7 @@
                 <w:szCs w:val="18"/>
                 <w:lang w:val="es-ES"/>
               </w:rPr>
-              <w:t xml:space="preserve">{% </w:t>
-            </w:r>
-            <w:proofErr w:type="spellStart"/>
-            <w:r>
-              <w:rPr>
-                <w:sz w:val="18"/>
-                <w:szCs w:val="18"/>
-                <w:lang w:val="es-ES"/>
-              </w:rPr>
-              <w:t>endfor</w:t>
-            </w:r>
-            <w:proofErr w:type="spellEnd"/>
-            <w:r>
-              <w:rPr>
-                <w:sz w:val="18"/>
-                <w:szCs w:val="18"/>
-                <w:lang w:val="es-ES"/>
-              </w:rPr>
-              <w:t xml:space="preserve"> %}</w:t>
+              <w:t>{% endfor %}</w:t>
             </w:r>
           </w:p>
         </w:tc>
@@ -1688,7 +1612,6 @@
         </w:rPr>
         <w:t xml:space="preserve"> </w:t>
       </w:r>
-      <w:proofErr w:type="gramStart"/>
       <w:r>
         <w:rPr>
           <w:sz w:val="18"/>
@@ -1705,7 +1628,6 @@
         </w:rPr>
         <w:t>problema</w:t>
       </w:r>
-      <w:proofErr w:type="gramEnd"/>
       <w:r>
         <w:rPr>
           <w:sz w:val="18"/>
@@ -1889,23 +1811,13 @@
               </w:rPr>
               <w:t xml:space="preserve">Srta. </w:t>
             </w:r>
-            <w:proofErr w:type="gramStart"/>
-            <w:r>
-              <w:rPr>
-                <w:sz w:val="18"/>
-                <w:szCs w:val="18"/>
-                <w:lang w:val="es-ES"/>
-              </w:rPr>
-              <w:t>{{ delegada</w:t>
-            </w:r>
-            <w:proofErr w:type="gramEnd"/>
-            <w:r>
-              <w:rPr>
-                <w:sz w:val="18"/>
-                <w:szCs w:val="18"/>
-                <w:lang w:val="es-ES"/>
-              </w:rPr>
-              <w:t xml:space="preserve"> }}</w:t>
+            <w:r>
+              <w:rPr>
+                <w:sz w:val="18"/>
+                <w:szCs w:val="18"/>
+                <w:lang w:val="es-ES"/>
+              </w:rPr>
+              <w:t>{{ delegada }}</w:t>
             </w:r>
           </w:p>
           <w:p>
@@ -1965,23 +1877,13 @@
               </w:rPr>
               <w:t xml:space="preserve"> de Servicios y Canales de la Agencia </w:t>
             </w:r>
-            <w:proofErr w:type="gramStart"/>
-            <w:r>
-              <w:rPr>
-                <w:sz w:val="18"/>
-                <w:szCs w:val="18"/>
-                <w:lang w:val="es-ES"/>
-              </w:rPr>
-              <w:t>{{ provincia</w:t>
-            </w:r>
-            <w:proofErr w:type="gramEnd"/>
-            <w:r>
-              <w:rPr>
-                <w:sz w:val="18"/>
-                <w:szCs w:val="18"/>
-                <w:lang w:val="es-ES"/>
-              </w:rPr>
-              <w:t xml:space="preserve"> }}</w:t>
+            <w:r>
+              <w:rPr>
+                <w:sz w:val="18"/>
+                <w:szCs w:val="18"/>
+                <w:lang w:val="es-ES"/>
+              </w:rPr>
+              <w:t>{{ provincia }}</w:t>
             </w:r>
           </w:p>
           <w:p>
@@ -2001,7 +1903,27 @@
                 <w:szCs w:val="18"/>
                 <w:lang w:val="es-ES"/>
               </w:rPr>
-              <w:t>BANECUADOR</w:t>
+              <w:t>BAN</w:t>
+            </w:r>
+            <w:r>
+              <w:rPr>
+                <w:b/>
+                <w:bCs/>
+                <w:sz w:val="18"/>
+                <w:szCs w:val="18"/>
+                <w:lang w:val="es-ES"/>
+              </w:rPr>
+              <w:t xml:space="preserve"> </w:t>
+            </w:r>
+            <w:r>
+              <w:rPr>
+                <w:b/>
+                <w:bCs/>
+                <w:sz w:val="18"/>
+                <w:szCs w:val="18"/>
+                <w:lang w:val="es-ES"/>
+              </w:rPr>
+              <w:t>ECUADOR</w:t>
             </w:r>
           </w:p>
         </w:tc>
@@ -2269,7 +2191,27 @@
                 <w:szCs w:val="18"/>
                 <w:lang w:val="es-ES"/>
               </w:rPr>
-              <w:t>BANECUADOR</w:t>
+              <w:t>BAN</w:t>
+            </w:r>
+            <w:r>
+              <w:rPr>
+                <w:b/>
+                <w:bCs/>
+                <w:sz w:val="18"/>
+                <w:szCs w:val="18"/>
+                <w:lang w:val="es-ES"/>
+              </w:rPr>
+              <w:t xml:space="preserve"> </w:t>
+            </w:r>
+            <w:r>
+              <w:rPr>
+                <w:b/>
+                <w:bCs/>
+                <w:sz w:val="18"/>
+                <w:szCs w:val="18"/>
+                <w:lang w:val="es-ES"/>
+              </w:rPr>
+              <w:t>ECUADOR</w:t>
             </w:r>
           </w:p>
         </w:tc>

</xml_diff>

<commit_message>
actualizacion de plantilla word
</commit_message>
<xml_diff>
--- a/plantilla.docx
+++ b/plantilla.docx
@@ -527,6 +527,7 @@
                 <w:szCs w:val="18"/>
               </w:rPr>
             </w:pPr>
+            <w:proofErr w:type="gramStart"/>
             <w:r>
               <w:t>{{</w:t>
             </w:r>
@@ -542,6 +543,7 @@
               </w:rPr>
               <w:t>fecha</w:t>
             </w:r>
+            <w:proofErr w:type="gramEnd"/>
             <w:r>
               <w:rPr>
                 <w:b/>
@@ -728,13 +730,23 @@
         </w:rPr>
         <w:t xml:space="preserve"> </w:t>
       </w:r>
-      <w:r>
-        <w:rPr>
-          <w:sz w:val="18"/>
-          <w:szCs w:val="18"/>
-          <w:lang w:val="es-ES"/>
-        </w:rPr>
-        <w:t>{{ delegada }}</w:t>
+      <w:proofErr w:type="gramStart"/>
+      <w:r>
+        <w:rPr>
+          <w:sz w:val="18"/>
+          <w:szCs w:val="18"/>
+          <w:lang w:val="es-ES"/>
+        </w:rPr>
+        <w:t>{{ delegada</w:t>
+      </w:r>
+      <w:proofErr w:type="gramEnd"/>
+      <w:r>
+        <w:rPr>
+          <w:sz w:val="18"/>
+          <w:szCs w:val="18"/>
+          <w:lang w:val="es-ES"/>
+        </w:rPr>
+        <w:t xml:space="preserve"> }}</w:t>
       </w:r>
       <w:r>
         <w:rPr>
@@ -858,6 +870,7 @@
         </w:rPr>
         <w:t xml:space="preserve">El servicio fue realizado por el técnico </w:t>
       </w:r>
+      <w:proofErr w:type="gramStart"/>
       <w:r>
         <w:rPr>
           <w:sz w:val="18"/>
@@ -874,6 +887,7 @@
         </w:rPr>
         <w:t>nombre</w:t>
       </w:r>
+      <w:proofErr w:type="gramEnd"/>
       <w:r>
         <w:rPr>
           <w:sz w:val="18"/>
@@ -1233,9 +1247,24 @@
               <w:rPr>
                 <w:sz w:val="18"/>
                 <w:szCs w:val="18"/>
-                <w:lang w:val="es-ES"/>
-              </w:rPr>
-              <w:t>{% for serie in series%}</w:t>
+              </w:rPr>
+              <w:t xml:space="preserve">{% </w:t>
+            </w:r>
+            <w:proofErr w:type="spellStart"/>
+            <w:r>
+              <w:rPr>
+                <w:sz w:val="18"/>
+                <w:szCs w:val="18"/>
+              </w:rPr>
+              <w:t>for</w:t>
+            </w:r>
+            <w:proofErr w:type="spellEnd"/>
+            <w:r>
+              <w:rPr>
+                <w:sz w:val="18"/>
+                <w:szCs w:val="18"/>
+              </w:rPr>
+              <w:t xml:space="preserve"> fila in filas %}</w:t>
             </w:r>
           </w:p>
         </w:tc>
@@ -1303,15 +1332,45 @@
                 <w:lang w:val="es-ES"/>
               </w:rPr>
             </w:pPr>
-            <w:r>
-              <w:rPr>
-                <w:b/>
-                <w:bCs/>
-                <w:sz w:val="18"/>
-                <w:szCs w:val="18"/>
-                <w:lang w:val="es-ES"/>
-              </w:rPr>
-              <w:t>{{ provincia }}</w:t>
+            <w:proofErr w:type="gramStart"/>
+            <w:r>
+              <w:rPr>
+                <w:b/>
+                <w:bCs/>
+                <w:sz w:val="18"/>
+                <w:szCs w:val="18"/>
+              </w:rPr>
+              <w:t xml:space="preserve">{{ </w:t>
+            </w:r>
+            <w:proofErr w:type="spellStart"/>
+            <w:r>
+              <w:rPr>
+                <w:b/>
+                <w:bCs/>
+                <w:sz w:val="18"/>
+                <w:szCs w:val="18"/>
+              </w:rPr>
+              <w:t>fila</w:t>
+            </w:r>
+            <w:proofErr w:type="gramEnd"/>
+            <w:r>
+              <w:rPr>
+                <w:b/>
+                <w:bCs/>
+                <w:sz w:val="18"/>
+                <w:szCs w:val="18"/>
+              </w:rPr>
+              <w:t>.provincia</w:t>
+            </w:r>
+            <w:proofErr w:type="spellEnd"/>
+            <w:r>
+              <w:rPr>
+                <w:b/>
+                <w:bCs/>
+                <w:sz w:val="18"/>
+                <w:szCs w:val="18"/>
+              </w:rPr>
+              <w:t xml:space="preserve"> }}</w:t>
             </w:r>
           </w:p>
         </w:tc>
@@ -1329,13 +1388,37 @@
                 <w:lang w:val="es-ES"/>
               </w:rPr>
             </w:pPr>
-            <w:r>
-              <w:rPr>
-                <w:sz w:val="18"/>
-                <w:szCs w:val="18"/>
-                <w:lang w:val="es-ES"/>
-              </w:rPr>
-              <w:t>Impresora Financiera</w:t>
+            <w:proofErr w:type="gramStart"/>
+            <w:r>
+              <w:rPr>
+                <w:sz w:val="18"/>
+                <w:szCs w:val="18"/>
+              </w:rPr>
+              <w:t xml:space="preserve">{{ </w:t>
+            </w:r>
+            <w:proofErr w:type="spellStart"/>
+            <w:r>
+              <w:rPr>
+                <w:sz w:val="18"/>
+                <w:szCs w:val="18"/>
+              </w:rPr>
+              <w:t>fila</w:t>
+            </w:r>
+            <w:proofErr w:type="gramEnd"/>
+            <w:r>
+              <w:rPr>
+                <w:sz w:val="18"/>
+                <w:szCs w:val="18"/>
+              </w:rPr>
+              <w:t>.detalle</w:t>
+            </w:r>
+            <w:proofErr w:type="spellEnd"/>
+            <w:r>
+              <w:rPr>
+                <w:sz w:val="18"/>
+                <w:szCs w:val="18"/>
+              </w:rPr>
+              <w:t xml:space="preserve"> }}</w:t>
             </w:r>
           </w:p>
         </w:tc>
@@ -1352,13 +1435,37 @@
                 <w:lang w:val="es-ES"/>
               </w:rPr>
             </w:pPr>
-            <w:r>
-              <w:rPr>
-                <w:sz w:val="18"/>
-                <w:szCs w:val="18"/>
-                <w:lang w:val="es-ES"/>
-              </w:rPr>
-              <w:t>{{ modelo }}</w:t>
+            <w:proofErr w:type="gramStart"/>
+            <w:r>
+              <w:rPr>
+                <w:sz w:val="18"/>
+                <w:szCs w:val="18"/>
+              </w:rPr>
+              <w:t xml:space="preserve">{{ </w:t>
+            </w:r>
+            <w:proofErr w:type="spellStart"/>
+            <w:r>
+              <w:rPr>
+                <w:sz w:val="18"/>
+                <w:szCs w:val="18"/>
+              </w:rPr>
+              <w:t>fila</w:t>
+            </w:r>
+            <w:proofErr w:type="gramEnd"/>
+            <w:r>
+              <w:rPr>
+                <w:sz w:val="18"/>
+                <w:szCs w:val="18"/>
+              </w:rPr>
+              <w:t>.modelo</w:t>
+            </w:r>
+            <w:proofErr w:type="spellEnd"/>
+            <w:r>
+              <w:rPr>
+                <w:sz w:val="18"/>
+                <w:szCs w:val="18"/>
+              </w:rPr>
+              <w:t xml:space="preserve"> }}</w:t>
             </w:r>
           </w:p>
         </w:tc>
@@ -1375,13 +1482,37 @@
                 <w:lang w:val="es-ES"/>
               </w:rPr>
             </w:pPr>
-            <w:r>
-              <w:rPr>
-                <w:sz w:val="18"/>
-                <w:szCs w:val="18"/>
-                <w:lang w:val="es-ES"/>
-              </w:rPr>
-              <w:t>{{ serie }}</w:t>
+            <w:proofErr w:type="gramStart"/>
+            <w:r>
+              <w:rPr>
+                <w:sz w:val="18"/>
+                <w:szCs w:val="18"/>
+              </w:rPr>
+              <w:t xml:space="preserve">{{ </w:t>
+            </w:r>
+            <w:proofErr w:type="spellStart"/>
+            <w:r>
+              <w:rPr>
+                <w:sz w:val="18"/>
+                <w:szCs w:val="18"/>
+              </w:rPr>
+              <w:t>fila</w:t>
+            </w:r>
+            <w:proofErr w:type="gramEnd"/>
+            <w:r>
+              <w:rPr>
+                <w:sz w:val="18"/>
+                <w:szCs w:val="18"/>
+              </w:rPr>
+              <w:t>.serie</w:t>
+            </w:r>
+            <w:proofErr w:type="spellEnd"/>
+            <w:r>
+              <w:rPr>
+                <w:sz w:val="18"/>
+                <w:szCs w:val="18"/>
+              </w:rPr>
+              <w:t xml:space="preserve"> }}</w:t>
             </w:r>
           </w:p>
         </w:tc>
@@ -1407,7 +1538,25 @@
                 <w:szCs w:val="18"/>
                 <w:lang w:val="es-ES"/>
               </w:rPr>
-              <w:t>{% endfor %}</w:t>
+              <w:t xml:space="preserve">{% </w:t>
+            </w:r>
+            <w:proofErr w:type="spellStart"/>
+            <w:r>
+              <w:rPr>
+                <w:sz w:val="18"/>
+                <w:szCs w:val="18"/>
+                <w:lang w:val="es-ES"/>
+              </w:rPr>
+              <w:t>endfor</w:t>
+            </w:r>
+            <w:proofErr w:type="spellEnd"/>
+            <w:r>
+              <w:rPr>
+                <w:sz w:val="18"/>
+                <w:szCs w:val="18"/>
+                <w:lang w:val="es-ES"/>
+              </w:rPr>
+              <w:t xml:space="preserve"> %}</w:t>
             </w:r>
           </w:p>
         </w:tc>
@@ -1618,23 +1767,15 @@
           <w:szCs w:val="18"/>
           <w:lang w:val="es-ES"/>
         </w:rPr>
-        <w:t xml:space="preserve">{{ </w:t>
-      </w:r>
-      <w:r>
-        <w:rPr>
-          <w:sz w:val="18"/>
-          <w:szCs w:val="18"/>
-          <w:lang w:val="es-ES"/>
-        </w:rPr>
-        <w:t>problema</w:t>
-      </w:r>
-      <w:r>
-        <w:rPr>
-          <w:sz w:val="18"/>
-          <w:szCs w:val="18"/>
-          <w:lang w:val="es-ES"/>
-        </w:rPr>
-        <w:t xml:space="preserve"> }}</w:t>
+        <w:t>{{problema</w:t>
+      </w:r>
+      <w:r>
+        <w:rPr>
+          <w:sz w:val="18"/>
+          <w:szCs w:val="18"/>
+          <w:lang w:val="es-ES"/>
+        </w:rPr>
+        <w:t>}}</w:t>
       </w:r>
     </w:p>
     <w:p>
@@ -1811,13 +1952,23 @@
               </w:rPr>
               <w:t xml:space="preserve">Srta. </w:t>
             </w:r>
-            <w:r>
-              <w:rPr>
-                <w:sz w:val="18"/>
-                <w:szCs w:val="18"/>
-                <w:lang w:val="es-ES"/>
-              </w:rPr>
-              <w:t>{{ delegada }}</w:t>
+            <w:proofErr w:type="gramStart"/>
+            <w:r>
+              <w:rPr>
+                <w:sz w:val="18"/>
+                <w:szCs w:val="18"/>
+                <w:lang w:val="es-ES"/>
+              </w:rPr>
+              <w:t>{{ delegada</w:t>
+            </w:r>
+            <w:proofErr w:type="gramEnd"/>
+            <w:r>
+              <w:rPr>
+                <w:sz w:val="18"/>
+                <w:szCs w:val="18"/>
+                <w:lang w:val="es-ES"/>
+              </w:rPr>
+              <w:t xml:space="preserve"> }}</w:t>
             </w:r>
           </w:p>
           <w:p>
@@ -1877,13 +2028,23 @@
               </w:rPr>
               <w:t xml:space="preserve"> de Servicios y Canales de la Agencia </w:t>
             </w:r>
-            <w:r>
-              <w:rPr>
-                <w:sz w:val="18"/>
-                <w:szCs w:val="18"/>
-                <w:lang w:val="es-ES"/>
-              </w:rPr>
-              <w:t>{{ provincia }}</w:t>
+            <w:proofErr w:type="gramStart"/>
+            <w:r>
+              <w:rPr>
+                <w:sz w:val="18"/>
+                <w:szCs w:val="18"/>
+                <w:lang w:val="es-ES"/>
+              </w:rPr>
+              <w:t>{{ provincia</w:t>
+            </w:r>
+            <w:proofErr w:type="gramEnd"/>
+            <w:r>
+              <w:rPr>
+                <w:sz w:val="18"/>
+                <w:szCs w:val="18"/>
+                <w:lang w:val="es-ES"/>
+              </w:rPr>
+              <w:t xml:space="preserve"> }}</w:t>
             </w:r>
           </w:p>
           <w:p>
@@ -3008,7 +3169,6 @@
   <w:style w:type="character" w:default="1" w:styleId="Fuentedeprrafopredeter">
     <w:name w:val="Default Paragraph Font"/>
     <w:uiPriority w:val="1"/>
-    <w:semiHidden/>
     <w:unhideWhenUsed/>
   </w:style>
   <w:style w:type="table" w:default="1" w:styleId="Tablanormal">

</xml_diff>

<commit_message>
actualizacion de plantilla tablas
</commit_message>
<xml_diff>
--- a/plantilla.docx
+++ b/plantilla.docx
@@ -1240,31 +1240,86 @@
               <w:rPr>
                 <w:sz w:val="18"/>
                 <w:szCs w:val="18"/>
-                <w:lang w:val="es-ES"/>
-              </w:rPr>
-            </w:pPr>
-            <w:r>
-              <w:rPr>
-                <w:sz w:val="18"/>
-                <w:szCs w:val="18"/>
-              </w:rPr>
-              <w:t xml:space="preserve">{% </w:t>
+                <w:lang w:val="en-US"/>
+              </w:rPr>
+            </w:pPr>
+            <w:r>
+              <w:rPr>
+                <w:sz w:val="18"/>
+                <w:szCs w:val="18"/>
+                <w:lang w:val="en-US"/>
+              </w:rPr>
+              <w:t xml:space="preserve">{% for fila in </w:t>
             </w:r>
             <w:proofErr w:type="spellStart"/>
             <w:r>
               <w:rPr>
                 <w:sz w:val="18"/>
                 <w:szCs w:val="18"/>
-              </w:rPr>
-              <w:t>for</w:t>
+                <w:lang w:val="en-US"/>
+              </w:rPr>
+              <w:t>filas</w:t>
             </w:r>
             <w:proofErr w:type="spellEnd"/>
             <w:r>
               <w:rPr>
                 <w:sz w:val="18"/>
                 <w:szCs w:val="18"/>
-              </w:rPr>
-              <w:t xml:space="preserve"> fila in filas %}</w:t>
+                <w:lang w:val="en-US"/>
+              </w:rPr>
+              <w:t xml:space="preserve"> </w:t>
+            </w:r>
+            <w:proofErr w:type="gramStart"/>
+            <w:r>
+              <w:rPr>
+                <w:sz w:val="18"/>
+                <w:szCs w:val="18"/>
+                <w:lang w:val="en-US"/>
+              </w:rPr>
+              <w:t>%}</w:t>
+            </w:r>
+            <w:r>
+              <w:rPr>
+                <w:b/>
+                <w:bCs/>
+                <w:sz w:val="18"/>
+                <w:szCs w:val="18"/>
+                <w:lang w:val="en-US"/>
+              </w:rPr>
+              <w:t>{</w:t>
+            </w:r>
+            <w:proofErr w:type="gramEnd"/>
+            <w:r>
+              <w:rPr>
+                <w:b/>
+                <w:bCs/>
+                <w:sz w:val="18"/>
+                <w:szCs w:val="18"/>
+                <w:lang w:val="en-US"/>
+              </w:rPr>
+              <w:t xml:space="preserve">{ </w:t>
+            </w:r>
+            <w:proofErr w:type="spellStart"/>
+            <w:r>
+              <w:rPr>
+                <w:b/>
+                <w:bCs/>
+                <w:sz w:val="18"/>
+                <w:szCs w:val="18"/>
+                <w:lang w:val="en-US"/>
+              </w:rPr>
+              <w:t>fila.provincia</w:t>
+            </w:r>
+            <w:proofErr w:type="spellEnd"/>
+            <w:r>
+              <w:rPr>
+                <w:b/>
+                <w:bCs/>
+                <w:sz w:val="18"/>
+                <w:szCs w:val="18"/>
+                <w:lang w:val="en-US"/>
+              </w:rPr>
+              <w:t xml:space="preserve"> }}</w:t>
             </w:r>
           </w:p>
         </w:tc>
@@ -1279,9 +1334,41 @@
               <w:rPr>
                 <w:sz w:val="18"/>
                 <w:szCs w:val="18"/>
-                <w:lang w:val="es-ES"/>
-              </w:rPr>
-            </w:pPr>
+                <w:lang w:val="en-US"/>
+              </w:rPr>
+            </w:pPr>
+            <w:proofErr w:type="gramStart"/>
+            <w:r>
+              <w:rPr>
+                <w:sz w:val="18"/>
+                <w:szCs w:val="18"/>
+              </w:rPr>
+              <w:t xml:space="preserve">{{ </w:t>
+            </w:r>
+            <w:proofErr w:type="spellStart"/>
+            <w:r>
+              <w:rPr>
+                <w:sz w:val="18"/>
+                <w:szCs w:val="18"/>
+              </w:rPr>
+              <w:t>fila</w:t>
+            </w:r>
+            <w:proofErr w:type="gramEnd"/>
+            <w:r>
+              <w:rPr>
+                <w:sz w:val="18"/>
+                <w:szCs w:val="18"/>
+              </w:rPr>
+              <w:t>.detalle</w:t>
+            </w:r>
+            <w:proofErr w:type="spellEnd"/>
+            <w:r>
+              <w:rPr>
+                <w:sz w:val="18"/>
+                <w:szCs w:val="18"/>
+              </w:rPr>
+              <w:t xml:space="preserve"> }}</w:t>
+            </w:r>
           </w:p>
         </w:tc>
         <w:tc>
@@ -1294,9 +1381,41 @@
               <w:rPr>
                 <w:sz w:val="18"/>
                 <w:szCs w:val="18"/>
-                <w:lang w:val="es-ES"/>
-              </w:rPr>
-            </w:pPr>
+                <w:lang w:val="en-US"/>
+              </w:rPr>
+            </w:pPr>
+            <w:proofErr w:type="gramStart"/>
+            <w:r>
+              <w:rPr>
+                <w:sz w:val="18"/>
+                <w:szCs w:val="18"/>
+              </w:rPr>
+              <w:t xml:space="preserve">{{ </w:t>
+            </w:r>
+            <w:proofErr w:type="spellStart"/>
+            <w:r>
+              <w:rPr>
+                <w:sz w:val="18"/>
+                <w:szCs w:val="18"/>
+              </w:rPr>
+              <w:t>fila</w:t>
+            </w:r>
+            <w:proofErr w:type="gramEnd"/>
+            <w:r>
+              <w:rPr>
+                <w:sz w:val="18"/>
+                <w:szCs w:val="18"/>
+              </w:rPr>
+              <w:t>.modelo</w:t>
+            </w:r>
+            <w:proofErr w:type="spellEnd"/>
+            <w:r>
+              <w:rPr>
+                <w:sz w:val="18"/>
+                <w:szCs w:val="18"/>
+              </w:rPr>
+              <w:t xml:space="preserve"> }}</w:t>
+            </w:r>
           </w:p>
         </w:tc>
         <w:tc>
@@ -1309,34 +1428,13 @@
               <w:rPr>
                 <w:sz w:val="18"/>
                 <w:szCs w:val="18"/>
-                <w:lang w:val="es-ES"/>
-              </w:rPr>
-            </w:pPr>
-          </w:p>
-        </w:tc>
-      </w:tr>
-      <w:tr>
-        <w:tc>
-          <w:tcPr>
-            <w:tcW w:w="1765" w:type="dxa"/>
-            <w:vAlign w:val="center"/>
-          </w:tcPr>
-          <w:p>
-            <w:pPr>
-              <w:jc w:val="center"/>
-              <w:rPr>
-                <w:b/>
-                <w:bCs/>
-                <w:sz w:val="18"/>
-                <w:szCs w:val="18"/>
-                <w:lang w:val="es-ES"/>
+                <w:u w:val="single"/>
+                <w:lang w:val="en-US"/>
               </w:rPr>
             </w:pPr>
             <w:proofErr w:type="gramStart"/>
             <w:r>
               <w:rPr>
-                <w:b/>
-                <w:bCs/>
                 <w:sz w:val="18"/>
                 <w:szCs w:val="18"/>
               </w:rPr>
@@ -1345,8 +1443,6 @@
             <w:proofErr w:type="spellStart"/>
             <w:r>
               <w:rPr>
-                <w:b/>
-                <w:bCs/>
                 <w:sz w:val="18"/>
                 <w:szCs w:val="18"/>
               </w:rPr>
@@ -1355,46 +1451,18 @@
             <w:proofErr w:type="gramEnd"/>
             <w:r>
               <w:rPr>
-                <w:b/>
-                <w:bCs/>
-                <w:sz w:val="18"/>
-                <w:szCs w:val="18"/>
-              </w:rPr>
-              <w:t>.provincia</w:t>
+                <w:sz w:val="18"/>
+                <w:szCs w:val="18"/>
+              </w:rPr>
+              <w:t>.serie</w:t>
             </w:r>
             <w:proofErr w:type="spellEnd"/>
             <w:r>
               <w:rPr>
-                <w:b/>
-                <w:bCs/>
-                <w:sz w:val="18"/>
-                <w:szCs w:val="18"/>
-              </w:rPr>
-              <w:t xml:space="preserve"> }}</w:t>
-            </w:r>
-          </w:p>
-        </w:tc>
-        <w:tc>
-          <w:tcPr>
-            <w:tcW w:w="1770" w:type="dxa"/>
-            <w:vAlign w:val="center"/>
-          </w:tcPr>
-          <w:p>
-            <w:pPr>
-              <w:jc w:val="center"/>
-              <w:rPr>
-                <w:sz w:val="18"/>
-                <w:szCs w:val="18"/>
-                <w:lang w:val="es-ES"/>
-              </w:rPr>
-            </w:pPr>
-            <w:proofErr w:type="gramStart"/>
-            <w:r>
-              <w:rPr>
-                <w:sz w:val="18"/>
-                <w:szCs w:val="18"/>
-              </w:rPr>
-              <w:t xml:space="preserve">{{ </w:t>
+                <w:sz w:val="18"/>
+                <w:szCs w:val="18"/>
+              </w:rPr>
+              <w:t xml:space="preserve"> }}{% </w:t>
             </w:r>
             <w:proofErr w:type="spellStart"/>
             <w:r>
@@ -1402,15 +1470,7 @@
                 <w:sz w:val="18"/>
                 <w:szCs w:val="18"/>
               </w:rPr>
-              <w:t>fila</w:t>
-            </w:r>
-            <w:proofErr w:type="gramEnd"/>
-            <w:r>
-              <w:rPr>
-                <w:sz w:val="18"/>
-                <w:szCs w:val="18"/>
-              </w:rPr>
-              <w:t>.detalle</w:t>
+              <w:t>endfor</w:t>
             </w:r>
             <w:proofErr w:type="spellEnd"/>
             <w:r>
@@ -1418,192 +1478,8 @@
                 <w:sz w:val="18"/>
                 <w:szCs w:val="18"/>
               </w:rPr>
-              <w:t xml:space="preserve"> }}</w:t>
-            </w:r>
-          </w:p>
-        </w:tc>
-        <w:tc>
-          <w:tcPr>
-            <w:tcW w:w="1761" w:type="dxa"/>
-          </w:tcPr>
-          <w:p>
-            <w:pPr>
-              <w:jc w:val="center"/>
-              <w:rPr>
-                <w:sz w:val="18"/>
-                <w:szCs w:val="18"/>
-                <w:lang w:val="es-ES"/>
-              </w:rPr>
-            </w:pPr>
-            <w:proofErr w:type="gramStart"/>
-            <w:r>
-              <w:rPr>
-                <w:sz w:val="18"/>
-                <w:szCs w:val="18"/>
-              </w:rPr>
-              <w:t xml:space="preserve">{{ </w:t>
-            </w:r>
-            <w:proofErr w:type="spellStart"/>
-            <w:r>
-              <w:rPr>
-                <w:sz w:val="18"/>
-                <w:szCs w:val="18"/>
-              </w:rPr>
-              <w:t>fila</w:t>
-            </w:r>
-            <w:proofErr w:type="gramEnd"/>
-            <w:r>
-              <w:rPr>
-                <w:sz w:val="18"/>
-                <w:szCs w:val="18"/>
-              </w:rPr>
-              <w:t>.modelo</w:t>
-            </w:r>
-            <w:proofErr w:type="spellEnd"/>
-            <w:r>
-              <w:rPr>
-                <w:sz w:val="18"/>
-                <w:szCs w:val="18"/>
-              </w:rPr>
-              <w:t xml:space="preserve"> }}</w:t>
-            </w:r>
-          </w:p>
-        </w:tc>
-        <w:tc>
-          <w:tcPr>
-            <w:tcW w:w="2325" w:type="dxa"/>
-          </w:tcPr>
-          <w:p>
-            <w:pPr>
-              <w:jc w:val="center"/>
-              <w:rPr>
-                <w:sz w:val="18"/>
-                <w:szCs w:val="18"/>
-                <w:lang w:val="es-ES"/>
-              </w:rPr>
-            </w:pPr>
-            <w:proofErr w:type="gramStart"/>
-            <w:r>
-              <w:rPr>
-                <w:sz w:val="18"/>
-                <w:szCs w:val="18"/>
-              </w:rPr>
-              <w:t xml:space="preserve">{{ </w:t>
-            </w:r>
-            <w:proofErr w:type="spellStart"/>
-            <w:r>
-              <w:rPr>
-                <w:sz w:val="18"/>
-                <w:szCs w:val="18"/>
-              </w:rPr>
-              <w:t>fila</w:t>
-            </w:r>
-            <w:proofErr w:type="gramEnd"/>
-            <w:r>
-              <w:rPr>
-                <w:sz w:val="18"/>
-                <w:szCs w:val="18"/>
-              </w:rPr>
-              <w:t>.serie</w:t>
-            </w:r>
-            <w:proofErr w:type="spellEnd"/>
-            <w:r>
-              <w:rPr>
-                <w:sz w:val="18"/>
-                <w:szCs w:val="18"/>
-              </w:rPr>
-              <w:t xml:space="preserve"> }}</w:t>
-            </w:r>
-          </w:p>
-        </w:tc>
-      </w:tr>
-      <w:tr>
-        <w:tc>
-          <w:tcPr>
-            <w:tcW w:w="1765" w:type="dxa"/>
-            <w:vAlign w:val="center"/>
-          </w:tcPr>
-          <w:p>
-            <w:pPr>
-              <w:jc w:val="center"/>
-              <w:rPr>
-                <w:sz w:val="18"/>
-                <w:szCs w:val="18"/>
-                <w:lang w:val="es-ES"/>
-              </w:rPr>
-            </w:pPr>
-            <w:r>
-              <w:rPr>
-                <w:sz w:val="18"/>
-                <w:szCs w:val="18"/>
-                <w:lang w:val="es-ES"/>
-              </w:rPr>
-              <w:t xml:space="preserve">{% </w:t>
-            </w:r>
-            <w:proofErr w:type="spellStart"/>
-            <w:r>
-              <w:rPr>
-                <w:sz w:val="18"/>
-                <w:szCs w:val="18"/>
-                <w:lang w:val="es-ES"/>
-              </w:rPr>
-              <w:t>endfor</w:t>
-            </w:r>
-            <w:proofErr w:type="spellEnd"/>
-            <w:r>
-              <w:rPr>
-                <w:sz w:val="18"/>
-                <w:szCs w:val="18"/>
-                <w:lang w:val="es-ES"/>
-              </w:rPr>
               <w:t xml:space="preserve"> %}</w:t>
             </w:r>
-          </w:p>
-        </w:tc>
-        <w:tc>
-          <w:tcPr>
-            <w:tcW w:w="1770" w:type="dxa"/>
-            <w:vAlign w:val="center"/>
-          </w:tcPr>
-          <w:p>
-            <w:pPr>
-              <w:jc w:val="center"/>
-              <w:rPr>
-                <w:sz w:val="18"/>
-                <w:szCs w:val="18"/>
-                <w:lang w:val="es-ES"/>
-              </w:rPr>
-            </w:pPr>
-          </w:p>
-        </w:tc>
-        <w:tc>
-          <w:tcPr>
-            <w:tcW w:w="1761" w:type="dxa"/>
-          </w:tcPr>
-          <w:p>
-            <w:pPr>
-              <w:jc w:val="center"/>
-              <w:rPr>
-                <w:sz w:val="18"/>
-                <w:szCs w:val="18"/>
-                <w:lang w:val="es-ES"/>
-              </w:rPr>
-            </w:pPr>
-          </w:p>
-        </w:tc>
-        <w:tc>
-          <w:tcPr>
-            <w:tcW w:w="2325" w:type="dxa"/>
-          </w:tcPr>
-          <w:p>
-            <w:pPr>
-              <w:jc w:val="center"/>
-              <w:rPr>
-                <w:sz w:val="18"/>
-                <w:szCs w:val="18"/>
-                <w:lang w:val="es-ES"/>
-              </w:rPr>
-            </w:pPr>
           </w:p>
         </w:tc>
       </w:tr>

</xml_diff>

<commit_message>
actualizacion de tabla en py
</commit_message>
<xml_diff>
--- a/plantilla.docx
+++ b/plantilla.docx
@@ -527,7 +527,6 @@
                 <w:szCs w:val="18"/>
               </w:rPr>
             </w:pPr>
-            <w:proofErr w:type="gramStart"/>
             <w:r>
               <w:t>{{</w:t>
             </w:r>
@@ -543,7 +542,6 @@
               </w:rPr>
               <w:t>fecha</w:t>
             </w:r>
-            <w:proofErr w:type="gramEnd"/>
             <w:r>
               <w:rPr>
                 <w:b/>
@@ -730,23 +728,13 @@
         </w:rPr>
         <w:t xml:space="preserve"> </w:t>
       </w:r>
-      <w:proofErr w:type="gramStart"/>
-      <w:r>
-        <w:rPr>
-          <w:sz w:val="18"/>
-          <w:szCs w:val="18"/>
-          <w:lang w:val="es-ES"/>
-        </w:rPr>
-        <w:t>{{ delegada</w:t>
-      </w:r>
-      <w:proofErr w:type="gramEnd"/>
-      <w:r>
-        <w:rPr>
-          <w:sz w:val="18"/>
-          <w:szCs w:val="18"/>
-          <w:lang w:val="es-ES"/>
-        </w:rPr>
-        <w:t xml:space="preserve"> }}</w:t>
+      <w:r>
+        <w:rPr>
+          <w:sz w:val="18"/>
+          <w:szCs w:val="18"/>
+          <w:lang w:val="es-ES"/>
+        </w:rPr>
+        <w:t>{{ delegada }}</w:t>
       </w:r>
       <w:r>
         <w:rPr>
@@ -870,7 +858,6 @@
         </w:rPr>
         <w:t xml:space="preserve">El servicio fue realizado por el técnico </w:t>
       </w:r>
-      <w:proofErr w:type="gramStart"/>
       <w:r>
         <w:rPr>
           <w:sz w:val="18"/>
@@ -887,7 +874,6 @@
         </w:rPr>
         <w:t>nombre</w:t>
       </w:r>
-      <w:proofErr w:type="gramEnd"/>
       <w:r>
         <w:rPr>
           <w:sz w:val="18"/>
@@ -1247,71 +1233,8 @@
               <w:rPr>
                 <w:sz w:val="18"/>
                 <w:szCs w:val="18"/>
-                <w:lang w:val="en-US"/>
-              </w:rPr>
-              <w:t xml:space="preserve">{% for fila in </w:t>
-            </w:r>
-            <w:proofErr w:type="spellStart"/>
-            <w:r>
-              <w:rPr>
-                <w:sz w:val="18"/>
-                <w:szCs w:val="18"/>
-                <w:lang w:val="en-US"/>
-              </w:rPr>
-              <w:t>filas</w:t>
-            </w:r>
-            <w:proofErr w:type="spellEnd"/>
-            <w:r>
-              <w:rPr>
-                <w:sz w:val="18"/>
-                <w:szCs w:val="18"/>
-                <w:lang w:val="en-US"/>
-              </w:rPr>
-              <w:t xml:space="preserve"> </w:t>
-            </w:r>
-            <w:proofErr w:type="gramStart"/>
-            <w:r>
-              <w:rPr>
-                <w:sz w:val="18"/>
-                <w:szCs w:val="18"/>
-                <w:lang w:val="en-US"/>
-              </w:rPr>
-              <w:t>%}</w:t>
-            </w:r>
-            <w:r>
-              <w:rPr>
-                <w:sz w:val="18"/>
-                <w:szCs w:val="18"/>
-                <w:lang w:val="en-US"/>
-              </w:rPr>
-              <w:t>{</w:t>
-            </w:r>
-            <w:proofErr w:type="gramEnd"/>
-            <w:r>
-              <w:rPr>
-                <w:sz w:val="18"/>
-                <w:szCs w:val="18"/>
-                <w:lang w:val="en-US"/>
-              </w:rPr>
-              <w:t xml:space="preserve">{ </w:t>
-            </w:r>
-            <w:proofErr w:type="spellStart"/>
-            <w:r>
-              <w:rPr>
-                <w:sz w:val="18"/>
-                <w:szCs w:val="18"/>
-                <w:lang w:val="en-US"/>
-              </w:rPr>
-              <w:t>fila.provincia</w:t>
-            </w:r>
-            <w:proofErr w:type="spellEnd"/>
-            <w:r>
-              <w:rPr>
-                <w:sz w:val="18"/>
-                <w:szCs w:val="18"/>
-                <w:lang w:val="en-US"/>
-              </w:rPr>
-              <w:t xml:space="preserve"> }}</w:t>
+              </w:rPr>
+              <w:t>{{ provincia }}</w:t>
             </w:r>
           </w:p>
         </w:tc>
@@ -1331,37 +1254,12 @@
                 <w:lang w:val="en-US"/>
               </w:rPr>
             </w:pPr>
-            <w:proofErr w:type="gramStart"/>
-            <w:r>
-              <w:rPr>
-                <w:sz w:val="18"/>
-                <w:szCs w:val="18"/>
-              </w:rPr>
-              <w:t xml:space="preserve">{{ </w:t>
-            </w:r>
-            <w:proofErr w:type="spellStart"/>
-            <w:r>
-              <w:rPr>
-                <w:sz w:val="18"/>
-                <w:szCs w:val="18"/>
-              </w:rPr>
-              <w:t>fila</w:t>
-            </w:r>
-            <w:proofErr w:type="gramEnd"/>
-            <w:r>
-              <w:rPr>
-                <w:sz w:val="18"/>
-                <w:szCs w:val="18"/>
-              </w:rPr>
-              <w:t>.detalle</w:t>
-            </w:r>
-            <w:proofErr w:type="spellEnd"/>
-            <w:r>
-              <w:rPr>
-                <w:sz w:val="18"/>
-                <w:szCs w:val="18"/>
-              </w:rPr>
-              <w:t xml:space="preserve"> }}</w:t>
+            <w:r>
+              <w:rPr>
+                <w:sz w:val="18"/>
+                <w:szCs w:val="18"/>
+              </w:rPr>
+              <w:t>Impresora Financiera</w:t>
             </w:r>
           </w:p>
         </w:tc>
@@ -1374,44 +1272,17 @@
             <w:pPr>
               <w:jc w:val="center"/>
               <w:rPr>
-                <w:b/>
-                <w:bCs/>
                 <w:sz w:val="18"/>
                 <w:szCs w:val="18"/>
                 <w:lang w:val="en-US"/>
               </w:rPr>
             </w:pPr>
-            <w:proofErr w:type="gramStart"/>
-            <w:r>
-              <w:rPr>
-                <w:sz w:val="18"/>
-                <w:szCs w:val="18"/>
-              </w:rPr>
-              <w:t xml:space="preserve">{{ </w:t>
-            </w:r>
-            <w:proofErr w:type="spellStart"/>
-            <w:r>
-              <w:rPr>
-                <w:sz w:val="18"/>
-                <w:szCs w:val="18"/>
-              </w:rPr>
-              <w:t>fila</w:t>
-            </w:r>
-            <w:proofErr w:type="gramEnd"/>
-            <w:r>
-              <w:rPr>
-                <w:sz w:val="18"/>
-                <w:szCs w:val="18"/>
-              </w:rPr>
-              <w:t>.modelo</w:t>
-            </w:r>
-            <w:proofErr w:type="spellEnd"/>
-            <w:r>
-              <w:rPr>
-                <w:sz w:val="18"/>
-                <w:szCs w:val="18"/>
-              </w:rPr>
-              <w:t xml:space="preserve"> }}</w:t>
+            <w:r>
+              <w:rPr>
+                <w:sz w:val="18"/>
+                <w:szCs w:val="18"/>
+              </w:rPr>
+              <w:t>{{ modelo }}</w:t>
             </w:r>
           </w:p>
         </w:tc>
@@ -1431,123 +1302,12 @@
                 <w:lang w:val="en-US"/>
               </w:rPr>
             </w:pPr>
-            <w:proofErr w:type="gramStart"/>
-            <w:r>
-              <w:rPr>
-                <w:sz w:val="18"/>
-                <w:szCs w:val="18"/>
-              </w:rPr>
-              <w:t xml:space="preserve">{{ </w:t>
-            </w:r>
-            <w:proofErr w:type="spellStart"/>
-            <w:r>
-              <w:rPr>
-                <w:sz w:val="18"/>
-                <w:szCs w:val="18"/>
-              </w:rPr>
-              <w:t>fila</w:t>
-            </w:r>
-            <w:proofErr w:type="gramEnd"/>
-            <w:r>
-              <w:rPr>
-                <w:sz w:val="18"/>
-                <w:szCs w:val="18"/>
-              </w:rPr>
-              <w:t>.serie</w:t>
-            </w:r>
-            <w:proofErr w:type="spellEnd"/>
-            <w:r>
-              <w:rPr>
-                <w:sz w:val="18"/>
-                <w:szCs w:val="18"/>
-              </w:rPr>
-              <w:t xml:space="preserve"> }}</w:t>
-            </w:r>
-          </w:p>
-        </w:tc>
-      </w:tr>
-      <w:tr>
-        <w:tc>
-          <w:tcPr>
-            <w:tcW w:w="1765" w:type="dxa"/>
-            <w:shd w:val="clear" w:color="auto" w:fill="auto"/>
-          </w:tcPr>
-          <w:p>
-            <w:pPr>
-              <w:jc w:val="center"/>
-              <w:rPr>
-                <w:sz w:val="18"/>
-                <w:szCs w:val="18"/>
-                <w:lang w:val="en-US"/>
-              </w:rPr>
-            </w:pPr>
-          </w:p>
-        </w:tc>
-        <w:tc>
-          <w:tcPr>
-            <w:tcW w:w="1770" w:type="dxa"/>
-            <w:shd w:val="clear" w:color="auto" w:fill="auto"/>
-          </w:tcPr>
-          <w:p>
-            <w:pPr>
-              <w:jc w:val="center"/>
-              <w:rPr>
-                <w:sz w:val="18"/>
-                <w:szCs w:val="18"/>
-              </w:rPr>
-            </w:pPr>
-          </w:p>
-        </w:tc>
-        <w:tc>
-          <w:tcPr>
-            <w:tcW w:w="1761" w:type="dxa"/>
-            <w:shd w:val="clear" w:color="auto" w:fill="auto"/>
-          </w:tcPr>
-          <w:p>
-            <w:pPr>
-              <w:jc w:val="center"/>
-              <w:rPr>
-                <w:sz w:val="18"/>
-                <w:szCs w:val="18"/>
-              </w:rPr>
-            </w:pPr>
-          </w:p>
-        </w:tc>
-        <w:tc>
-          <w:tcPr>
-            <w:tcW w:w="2325" w:type="dxa"/>
-            <w:shd w:val="clear" w:color="auto" w:fill="auto"/>
-          </w:tcPr>
-          <w:p>
-            <w:pPr>
-              <w:jc w:val="center"/>
-              <w:rPr>
-                <w:sz w:val="18"/>
-                <w:szCs w:val="18"/>
-              </w:rPr>
-            </w:pPr>
-            <w:r>
-              <w:rPr>
-                <w:sz w:val="18"/>
-                <w:szCs w:val="18"/>
-              </w:rPr>
-              <w:t xml:space="preserve">{% </w:t>
-            </w:r>
-            <w:proofErr w:type="spellStart"/>
-            <w:r>
-              <w:rPr>
-                <w:sz w:val="18"/>
-                <w:szCs w:val="18"/>
-              </w:rPr>
-              <w:t>endfor</w:t>
-            </w:r>
-            <w:proofErr w:type="spellEnd"/>
-            <w:r>
-              <w:rPr>
-                <w:sz w:val="18"/>
-                <w:szCs w:val="18"/>
-              </w:rPr>
-              <w:t xml:space="preserve"> %}</w:t>
+            <w:r>
+              <w:rPr>
+                <w:sz w:val="18"/>
+                <w:szCs w:val="18"/>
+              </w:rPr>
+              <w:t>{{ serie_principal }}</w:t>
             </w:r>
           </w:p>
         </w:tc>
@@ -1897,23 +1657,13 @@
               </w:rPr>
               <w:t xml:space="preserve">Srta. </w:t>
             </w:r>
-            <w:proofErr w:type="gramStart"/>
-            <w:r>
-              <w:rPr>
-                <w:sz w:val="18"/>
-                <w:szCs w:val="18"/>
-                <w:lang w:val="es-ES"/>
-              </w:rPr>
-              <w:t>{{ delegada</w:t>
-            </w:r>
-            <w:proofErr w:type="gramEnd"/>
-            <w:r>
-              <w:rPr>
-                <w:sz w:val="18"/>
-                <w:szCs w:val="18"/>
-                <w:lang w:val="es-ES"/>
-              </w:rPr>
-              <w:t xml:space="preserve"> }}</w:t>
+            <w:r>
+              <w:rPr>
+                <w:sz w:val="18"/>
+                <w:szCs w:val="18"/>
+                <w:lang w:val="es-ES"/>
+              </w:rPr>
+              <w:t>{{ delegada }}</w:t>
             </w:r>
           </w:p>
           <w:p>
@@ -1973,23 +1723,13 @@
               </w:rPr>
               <w:t xml:space="preserve"> de Servicios y Canales de la Agencia </w:t>
             </w:r>
-            <w:proofErr w:type="gramStart"/>
-            <w:r>
-              <w:rPr>
-                <w:sz w:val="18"/>
-                <w:szCs w:val="18"/>
-                <w:lang w:val="es-ES"/>
-              </w:rPr>
-              <w:t>{{ provincia</w:t>
-            </w:r>
-            <w:proofErr w:type="gramEnd"/>
-            <w:r>
-              <w:rPr>
-                <w:sz w:val="18"/>
-                <w:szCs w:val="18"/>
-                <w:lang w:val="es-ES"/>
-              </w:rPr>
-              <w:t xml:space="preserve"> }}</w:t>
+            <w:r>
+              <w:rPr>
+                <w:sz w:val="18"/>
+                <w:szCs w:val="18"/>
+                <w:lang w:val="es-ES"/>
+              </w:rPr>
+              <w:t>{{ provincia }}</w:t>
             </w:r>
           </w:p>
           <w:p>

</xml_diff>

<commit_message>
agregar series solo por texto
</commit_message>
<xml_diff>
--- a/plantilla.docx
+++ b/plantilla.docx
@@ -527,6 +527,7 @@
                 <w:szCs w:val="18"/>
               </w:rPr>
             </w:pPr>
+            <w:proofErr w:type="gramStart"/>
             <w:r>
               <w:t>{{</w:t>
             </w:r>
@@ -542,6 +543,7 @@
               </w:rPr>
               <w:t>fecha</w:t>
             </w:r>
+            <w:proofErr w:type="gramEnd"/>
             <w:r>
               <w:rPr>
                 <w:b/>
@@ -728,13 +730,23 @@
         </w:rPr>
         <w:t xml:space="preserve"> </w:t>
       </w:r>
-      <w:r>
-        <w:rPr>
-          <w:sz w:val="18"/>
-          <w:szCs w:val="18"/>
-          <w:lang w:val="es-ES"/>
-        </w:rPr>
-        <w:t>{{ delegada }}</w:t>
+      <w:proofErr w:type="gramStart"/>
+      <w:r>
+        <w:rPr>
+          <w:sz w:val="18"/>
+          <w:szCs w:val="18"/>
+          <w:lang w:val="es-ES"/>
+        </w:rPr>
+        <w:t>{{ delegada</w:t>
+      </w:r>
+      <w:proofErr w:type="gramEnd"/>
+      <w:r>
+        <w:rPr>
+          <w:sz w:val="18"/>
+          <w:szCs w:val="18"/>
+          <w:lang w:val="es-ES"/>
+        </w:rPr>
+        <w:t xml:space="preserve"> }}</w:t>
       </w:r>
       <w:r>
         <w:rPr>
@@ -858,6 +870,7 @@
         </w:rPr>
         <w:t xml:space="preserve">El servicio fue realizado por el técnico </w:t>
       </w:r>
+      <w:proofErr w:type="gramStart"/>
       <w:r>
         <w:rPr>
           <w:sz w:val="18"/>
@@ -874,6 +887,7 @@
         </w:rPr>
         <w:t>nombre</w:t>
       </w:r>
+      <w:proofErr w:type="gramEnd"/>
       <w:r>
         <w:rPr>
           <w:sz w:val="18"/>
@@ -1224,17 +1238,32 @@
             <w:pPr>
               <w:jc w:val="center"/>
               <w:rPr>
+                <w:b/>
+                <w:bCs/>
                 <w:sz w:val="18"/>
                 <w:szCs w:val="18"/>
                 <w:lang w:val="en-US"/>
               </w:rPr>
             </w:pPr>
-            <w:r>
-              <w:rPr>
-                <w:sz w:val="18"/>
-                <w:szCs w:val="18"/>
-              </w:rPr>
-              <w:t>{{ provincia }}</w:t>
+            <w:proofErr w:type="gramStart"/>
+            <w:r>
+              <w:rPr>
+                <w:b/>
+                <w:bCs/>
+                <w:sz w:val="18"/>
+                <w:szCs w:val="18"/>
+              </w:rPr>
+              <w:t>{{ provincia</w:t>
+            </w:r>
+            <w:proofErr w:type="gramEnd"/>
+            <w:r>
+              <w:rPr>
+                <w:b/>
+                <w:bCs/>
+                <w:sz w:val="18"/>
+                <w:szCs w:val="18"/>
+              </w:rPr>
+              <w:t xml:space="preserve"> }}</w:t>
             </w:r>
           </w:p>
         </w:tc>
@@ -1277,12 +1306,21 @@
                 <w:lang w:val="en-US"/>
               </w:rPr>
             </w:pPr>
-            <w:r>
-              <w:rPr>
-                <w:sz w:val="18"/>
-                <w:szCs w:val="18"/>
-              </w:rPr>
-              <w:t>{{ modelo }}</w:t>
+            <w:proofErr w:type="gramStart"/>
+            <w:r>
+              <w:rPr>
+                <w:sz w:val="18"/>
+                <w:szCs w:val="18"/>
+              </w:rPr>
+              <w:t>{{ modelo</w:t>
+            </w:r>
+            <w:proofErr w:type="gramEnd"/>
+            <w:r>
+              <w:rPr>
+                <w:sz w:val="18"/>
+                <w:szCs w:val="18"/>
+              </w:rPr>
+              <w:t xml:space="preserve"> }}</w:t>
             </w:r>
           </w:p>
         </w:tc>
@@ -1295,19 +1333,42 @@
             <w:pPr>
               <w:jc w:val="center"/>
               <w:rPr>
-                <w:b/>
-                <w:bCs/>
-                <w:sz w:val="18"/>
-                <w:szCs w:val="18"/>
-                <w:lang w:val="en-US"/>
-              </w:rPr>
-            </w:pPr>
-            <w:r>
-              <w:rPr>
-                <w:sz w:val="18"/>
-                <w:szCs w:val="18"/>
-              </w:rPr>
-              <w:t>{{ serie_principal }}</w:t>
+                <w:sz w:val="18"/>
+                <w:szCs w:val="18"/>
+                <w:u w:val="single"/>
+              </w:rPr>
+            </w:pPr>
+            <w:proofErr w:type="gramStart"/>
+            <w:r>
+              <w:rPr>
+                <w:sz w:val="18"/>
+                <w:szCs w:val="18"/>
+              </w:rPr>
+              <w:t xml:space="preserve">{{ </w:t>
+            </w:r>
+            <w:proofErr w:type="spellStart"/>
+            <w:r>
+              <w:rPr>
+                <w:sz w:val="18"/>
+                <w:szCs w:val="18"/>
+              </w:rPr>
+              <w:t>series</w:t>
+            </w:r>
+            <w:proofErr w:type="gramEnd"/>
+            <w:r>
+              <w:rPr>
+                <w:sz w:val="18"/>
+                <w:szCs w:val="18"/>
+              </w:rPr>
+              <w:t>_texto</w:t>
+            </w:r>
+            <w:proofErr w:type="spellEnd"/>
+            <w:r>
+              <w:rPr>
+                <w:sz w:val="18"/>
+                <w:szCs w:val="18"/>
+              </w:rPr>
+              <w:t xml:space="preserve"> }}</w:t>
             </w:r>
           </w:p>
         </w:tc>
@@ -1657,13 +1718,23 @@
               </w:rPr>
               <w:t xml:space="preserve">Srta. </w:t>
             </w:r>
-            <w:r>
-              <w:rPr>
-                <w:sz w:val="18"/>
-                <w:szCs w:val="18"/>
-                <w:lang w:val="es-ES"/>
-              </w:rPr>
-              <w:t>{{ delegada }}</w:t>
+            <w:proofErr w:type="gramStart"/>
+            <w:r>
+              <w:rPr>
+                <w:sz w:val="18"/>
+                <w:szCs w:val="18"/>
+                <w:lang w:val="es-ES"/>
+              </w:rPr>
+              <w:t>{{ delegada</w:t>
+            </w:r>
+            <w:proofErr w:type="gramEnd"/>
+            <w:r>
+              <w:rPr>
+                <w:sz w:val="18"/>
+                <w:szCs w:val="18"/>
+                <w:lang w:val="es-ES"/>
+              </w:rPr>
+              <w:t xml:space="preserve"> }}</w:t>
             </w:r>
           </w:p>
           <w:p>
@@ -1723,13 +1794,23 @@
               </w:rPr>
               <w:t xml:space="preserve"> de Servicios y Canales de la Agencia </w:t>
             </w:r>
-            <w:r>
-              <w:rPr>
-                <w:sz w:val="18"/>
-                <w:szCs w:val="18"/>
-                <w:lang w:val="es-ES"/>
-              </w:rPr>
-              <w:t>{{ provincia }}</w:t>
+            <w:proofErr w:type="gramStart"/>
+            <w:r>
+              <w:rPr>
+                <w:sz w:val="18"/>
+                <w:szCs w:val="18"/>
+                <w:lang w:val="es-ES"/>
+              </w:rPr>
+              <w:t>{{ provincia</w:t>
+            </w:r>
+            <w:proofErr w:type="gramEnd"/>
+            <w:r>
+              <w:rPr>
+                <w:sz w:val="18"/>
+                <w:szCs w:val="18"/>
+                <w:lang w:val="es-ES"/>
+              </w:rPr>
+              <w:t xml:space="preserve"> }}</w:t>
             </w:r>
           </w:p>
           <w:p>

</xml_diff>

<commit_message>
se actualiza la variable provincia por zonal en word
</commit_message>
<xml_diff>
--- a/plantilla.docx
+++ b/plantilla.docx
@@ -1253,7 +1253,16 @@
                 <w:sz w:val="18"/>
                 <w:szCs w:val="18"/>
               </w:rPr>
-              <w:t>{{ provincia</w:t>
+              <w:t xml:space="preserve">{{ </w:t>
+            </w:r>
+            <w:r>
+              <w:rPr>
+                <w:b/>
+                <w:bCs/>
+                <w:sz w:val="18"/>
+                <w:szCs w:val="18"/>
+              </w:rPr>
+              <w:t>zonal</w:t>
             </w:r>
             <w:proofErr w:type="gramEnd"/>
             <w:r>

</xml_diff>

<commit_message>
actualizar fecha en informe
</commit_message>
<xml_diff>
--- a/plantilla.docx
+++ b/plantilla.docx
@@ -599,21 +599,57 @@
         </w:rPr>
         <w:t xml:space="preserve">A los </w:t>
       </w:r>
-      <w:r>
-        <w:rPr>
-          <w:sz w:val="18"/>
-          <w:szCs w:val="18"/>
-          <w:lang w:val="es-ES"/>
-        </w:rPr>
-        <w:t>0</w:t>
-      </w:r>
-      <w:r>
-        <w:rPr>
-          <w:sz w:val="18"/>
-          <w:szCs w:val="18"/>
-          <w:lang w:val="es-ES"/>
-        </w:rPr>
-        <w:t>8</w:t>
+      <w:proofErr w:type="gramStart"/>
+      <w:r>
+        <w:rPr>
+          <w:sz w:val="18"/>
+          <w:szCs w:val="18"/>
+          <w:lang w:val="es-ES"/>
+        </w:rPr>
+        <w:t xml:space="preserve">{{ </w:t>
+      </w:r>
+      <w:proofErr w:type="spellStart"/>
+      <w:r>
+        <w:rPr>
+          <w:sz w:val="18"/>
+          <w:szCs w:val="18"/>
+          <w:lang w:val="es-ES"/>
+        </w:rPr>
+        <w:t>contexto</w:t>
+      </w:r>
+      <w:proofErr w:type="gramEnd"/>
+      <w:r>
+        <w:rPr>
+          <w:sz w:val="18"/>
+          <w:szCs w:val="18"/>
+          <w:lang w:val="es-ES"/>
+        </w:rPr>
+        <w:t>_fecha_larga</w:t>
+      </w:r>
+      <w:proofErr w:type="spellEnd"/>
+      <w:r>
+        <w:rPr>
+          <w:sz w:val="18"/>
+          <w:szCs w:val="18"/>
+          <w:lang w:val="es-ES"/>
+        </w:rPr>
+        <w:t xml:space="preserve"> }}</w:t>
+      </w:r>
+      <w:r>
+        <w:rPr>
+          <w:sz w:val="18"/>
+          <w:szCs w:val="18"/>
+          <w:lang w:val="es-ES"/>
+        </w:rPr>
+        <w:t>, comparecen a la suscripción de la presente acta entrega recepción; por una parte, BANECUADOR representada por</w:t>
+      </w:r>
+      <w:r>
+        <w:rPr>
+          <w:sz w:val="18"/>
+          <w:szCs w:val="18"/>
+          <w:lang w:val="es-ES"/>
+        </w:rPr>
+        <w:t xml:space="preserve"> el/la</w:t>
       </w:r>
       <w:r>
         <w:rPr>
@@ -625,67 +661,30 @@
       </w:r>
       <w:r>
         <w:rPr>
-          <w:sz w:val="18"/>
-          <w:szCs w:val="18"/>
-          <w:lang w:val="es-ES"/>
-        </w:rPr>
-        <w:t>días</w:t>
-      </w:r>
-      <w:r>
-        <w:rPr>
-          <w:sz w:val="18"/>
-          <w:szCs w:val="18"/>
-          <w:lang w:val="es-ES"/>
-        </w:rPr>
-        <w:t xml:space="preserve"> del mes</w:t>
-      </w:r>
-      <w:r>
-        <w:rPr>
-          <w:sz w:val="18"/>
-          <w:szCs w:val="18"/>
-          <w:lang w:val="es-ES"/>
-        </w:rPr>
-        <w:t xml:space="preserve"> de </w:t>
-      </w:r>
-      <w:r>
-        <w:rPr>
-          <w:sz w:val="18"/>
-          <w:szCs w:val="18"/>
-          <w:lang w:val="es-ES"/>
-        </w:rPr>
-        <w:t>diciembre</w:t>
-      </w:r>
-      <w:r>
-        <w:rPr>
-          <w:sz w:val="18"/>
-          <w:szCs w:val="18"/>
-          <w:lang w:val="es-ES"/>
-        </w:rPr>
-        <w:t xml:space="preserve"> del 202</w:t>
-      </w:r>
-      <w:r>
-        <w:rPr>
-          <w:sz w:val="18"/>
-          <w:szCs w:val="18"/>
-          <w:lang w:val="es-ES"/>
-        </w:rPr>
-        <w:t>5</w:t>
-      </w:r>
-      <w:r>
-        <w:rPr>
-          <w:sz w:val="18"/>
-          <w:szCs w:val="18"/>
-          <w:lang w:val="es-ES"/>
-        </w:rPr>
-        <w:t>, comparecen a la suscripción de la presente acta entrega recepción; por una parte, BANECUADOR representada por</w:t>
-      </w:r>
-      <w:r>
-        <w:rPr>
-          <w:sz w:val="18"/>
-          <w:szCs w:val="18"/>
-          <w:lang w:val="es-ES"/>
-        </w:rPr>
-        <w:t xml:space="preserve"> el/la</w:t>
+          <w:rFonts w:ascii="Calibri" w:eastAsia="Calibri" w:hAnsi="Calibri" w:cs="Calibri"/>
+          <w:sz w:val="18"/>
+          <w:szCs w:val="18"/>
+          <w:lang w:val="es-ES"/>
+        </w:rPr>
+        <w:t>Sr</w:t>
+      </w:r>
+      <w:r>
+        <w:rPr>
+          <w:rFonts w:ascii="Calibri" w:eastAsia="Calibri" w:hAnsi="Calibri" w:cs="Calibri"/>
+          <w:sz w:val="18"/>
+          <w:szCs w:val="18"/>
+          <w:lang w:val="es-ES"/>
+        </w:rPr>
+        <w:t>/Sr</w:t>
+      </w:r>
+      <w:r>
+        <w:rPr>
+          <w:rFonts w:ascii="Calibri" w:eastAsia="Calibri" w:hAnsi="Calibri" w:cs="Calibri"/>
+          <w:sz w:val="18"/>
+          <w:szCs w:val="18"/>
+          <w:lang w:val="es-ES"/>
+        </w:rPr>
+        <w:t>ta.</w:t>
       </w:r>
       <w:r>
         <w:rPr>
@@ -697,56 +696,11 @@
       </w:r>
       <w:r>
         <w:rPr>
-          <w:rFonts w:ascii="Calibri" w:eastAsia="Calibri" w:hAnsi="Calibri" w:cs="Calibri"/>
-          <w:sz w:val="18"/>
-          <w:szCs w:val="18"/>
-          <w:lang w:val="es-ES"/>
-        </w:rPr>
-        <w:t>Sr</w:t>
-      </w:r>
-      <w:r>
-        <w:rPr>
-          <w:rFonts w:ascii="Calibri" w:eastAsia="Calibri" w:hAnsi="Calibri" w:cs="Calibri"/>
-          <w:sz w:val="18"/>
-          <w:szCs w:val="18"/>
-          <w:lang w:val="es-ES"/>
-        </w:rPr>
-        <w:t>/Sr</w:t>
-      </w:r>
-      <w:r>
-        <w:rPr>
-          <w:rFonts w:ascii="Calibri" w:eastAsia="Calibri" w:hAnsi="Calibri" w:cs="Calibri"/>
-          <w:sz w:val="18"/>
-          <w:szCs w:val="18"/>
-          <w:lang w:val="es-ES"/>
-        </w:rPr>
-        <w:t>ta.</w:t>
-      </w:r>
-      <w:r>
-        <w:rPr>
-          <w:sz w:val="18"/>
-          <w:szCs w:val="18"/>
-          <w:lang w:val="es-ES"/>
-        </w:rPr>
-        <w:t xml:space="preserve"> </w:t>
-      </w:r>
-      <w:proofErr w:type="gramStart"/>
-      <w:r>
-        <w:rPr>
-          <w:sz w:val="18"/>
-          <w:szCs w:val="18"/>
-          <w:lang w:val="es-ES"/>
-        </w:rPr>
-        <w:t>{{ delegada</w:t>
-      </w:r>
-      <w:proofErr w:type="gramEnd"/>
-      <w:r>
-        <w:rPr>
-          <w:sz w:val="18"/>
-          <w:szCs w:val="18"/>
-          <w:lang w:val="es-ES"/>
-        </w:rPr>
-        <w:t xml:space="preserve"> }}</w:t>
+          <w:sz w:val="18"/>
+          <w:szCs w:val="18"/>
+          <w:lang w:val="es-ES"/>
+        </w:rPr>
+        <w:t>{{ delegada }}</w:t>
       </w:r>
       <w:r>
         <w:rPr>
@@ -1024,55 +978,25 @@
           <w:szCs w:val="18"/>
           <w:lang w:val="es-ES"/>
         </w:rPr>
-        <w:t>0</w:t>
-      </w:r>
-      <w:r>
-        <w:rPr>
-          <w:sz w:val="18"/>
-          <w:szCs w:val="18"/>
-          <w:lang w:val="es-ES"/>
-        </w:rPr>
-        <w:t>8</w:t>
-      </w:r>
-      <w:r>
-        <w:rPr>
-          <w:sz w:val="18"/>
-          <w:szCs w:val="18"/>
-          <w:lang w:val="es-ES"/>
-        </w:rPr>
-        <w:t xml:space="preserve"> de </w:t>
-      </w:r>
-      <w:r>
-        <w:rPr>
-          <w:sz w:val="18"/>
-          <w:szCs w:val="18"/>
-          <w:lang w:val="es-ES"/>
-        </w:rPr>
-        <w:t>diciembre</w:t>
-      </w:r>
-      <w:r>
-        <w:rPr>
-          <w:sz w:val="18"/>
-          <w:szCs w:val="18"/>
-          <w:lang w:val="es-ES"/>
-        </w:rPr>
-        <w:t xml:space="preserve"> </w:t>
-      </w:r>
-      <w:r>
-        <w:rPr>
-          <w:sz w:val="18"/>
-          <w:szCs w:val="18"/>
-          <w:lang w:val="es-ES"/>
-        </w:rPr>
-        <w:t>del 202</w:t>
-      </w:r>
-      <w:r>
-        <w:rPr>
-          <w:sz w:val="18"/>
-          <w:szCs w:val="18"/>
-          <w:lang w:val="es-ES"/>
-        </w:rPr>
-        <w:t>5</w:t>
+        <w:t xml:space="preserve">{{ </w:t>
+      </w:r>
+      <w:proofErr w:type="spellStart"/>
+      <w:r>
+        <w:rPr>
+          <w:sz w:val="18"/>
+          <w:szCs w:val="18"/>
+          <w:lang w:val="es-ES"/>
+        </w:rPr>
+        <w:t>contexto_fecha_larga</w:t>
+      </w:r>
+      <w:proofErr w:type="spellEnd"/>
+      <w:r>
+        <w:rPr>
+          <w:sz w:val="18"/>
+          <w:szCs w:val="18"/>
+          <w:lang w:val="es-ES"/>
+        </w:rPr>
+        <w:t xml:space="preserve"> }}</w:t>
       </w:r>
       <w:r>
         <w:rPr>
@@ -2944,6 +2868,7 @@
   <w:style w:type="character" w:default="1" w:styleId="Fuentedeprrafopredeter">
     <w:name w:val="Default Paragraph Font"/>
     <w:uiPriority w:val="1"/>
+    <w:semiHidden/>
     <w:unhideWhenUsed/>
   </w:style>
   <w:style w:type="table" w:default="1" w:styleId="Tablanormal">

</xml_diff>

<commit_message>
actualizacion de fecha corta
</commit_message>
<xml_diff>
--- a/plantilla.docx
+++ b/plantilla.docx
@@ -521,40 +521,41 @@
               <w:spacing w:before="20"/>
               <w:jc w:val="both"/>
               <w:rPr>
-                <w:b/>
-                <w:bCs/>
                 <w:sz w:val="18"/>
                 <w:szCs w:val="18"/>
               </w:rPr>
             </w:pPr>
             <w:proofErr w:type="gramStart"/>
             <w:r>
-              <w:t>{{</w:t>
-            </w:r>
-            <w:r>
-              <w:t xml:space="preserve"> </w:t>
-            </w:r>
-            <w:r>
-              <w:rPr>
-                <w:b/>
-                <w:bCs/>
-                <w:sz w:val="18"/>
-                <w:szCs w:val="18"/>
-              </w:rPr>
-              <w:t>fecha</w:t>
+              <w:rPr>
+                <w:sz w:val="18"/>
+                <w:szCs w:val="18"/>
+              </w:rPr>
+              <w:t xml:space="preserve">{{ </w:t>
+            </w:r>
+            <w:proofErr w:type="spellStart"/>
+            <w:r>
+              <w:rPr>
+                <w:sz w:val="18"/>
+                <w:szCs w:val="18"/>
+              </w:rPr>
+              <w:t>contexto</w:t>
             </w:r>
             <w:proofErr w:type="gramEnd"/>
             <w:r>
               <w:rPr>
-                <w:b/>
-                <w:bCs/>
-                <w:sz w:val="18"/>
-                <w:szCs w:val="18"/>
-              </w:rPr>
-              <w:t xml:space="preserve"> </w:t>
-            </w:r>
-            <w:r>
-              <w:t>}}</w:t>
+                <w:sz w:val="18"/>
+                <w:szCs w:val="18"/>
+              </w:rPr>
+              <w:t>_fecha_corta</w:t>
+            </w:r>
+            <w:proofErr w:type="spellEnd"/>
+            <w:r>
+              <w:rPr>
+                <w:sz w:val="18"/>
+                <w:szCs w:val="18"/>
+              </w:rPr>
+              <w:t xml:space="preserve"> }}</w:t>
             </w:r>
           </w:p>
         </w:tc>
@@ -987,7 +988,7 @@
           <w:szCs w:val="18"/>
           <w:lang w:val="es-ES"/>
         </w:rPr>
-        <w:t>contexto_fecha_larga</w:t>
+        <w:t>contexto_fecha_corta</w:t>
       </w:r>
       <w:proofErr w:type="spellEnd"/>
       <w:r>

</xml_diff>